<commit_message>
Update YouTube script: more balanced, better structure, less bias
https://claude.ai/code/session_01UCsqcSBVJHQqXEgMPyvNno
</commit_message>
<xml_diff>
--- a/scripts/zoominfo-vs-outbound-agency-script.docx
+++ b/scripts/zoominfo-vs-outbound-agency-script.docx
@@ -49,7 +49,7 @@
           <w:color w:val="969696"/>
           <w:sz w:val="18"/>
         </w:rPr>
-        <w:t>[0:00 - 0:30]</w:t>
+        <w:t>[0:00 - 0:25]</w:t>
       </w:r>
     </w:p>
     <w:p>
@@ -57,7 +57,7 @@
         <w:spacing w:after="160"/>
       </w:pPr>
       <w:r>
-        <w:t>We've booked almost 500 sales meetings for branded merch companies in the past three months using cold email outreach. We also helped a promo company close a Fortune 100 deal. And we've gotten leads from companies like Stripe, Uber, and Hilton for our clients.</w:t>
+        <w:t>My agency has booked almost 500 sales meetings for branded merch companies in the past three months using cold outbound. I've also had clients come to me after spending $15,000 to $30,000 a year on ZoomInfo and getting almost nothing from it.</w:t>
       </w:r>
     </w:p>
     <w:p>
@@ -65,15 +65,7 @@
         <w:spacing w:after="160"/>
       </w:pPr>
       <w:r>
-        <w:t>I've also personally used ZoomInfo. I've had clients come to me after spending $15,000 to $30,000 a year on it and getting almost nothing.</w:t>
-      </w:r>
-    </w:p>
-    <w:p>
-      <w:pPr>
-        <w:spacing w:after="160"/>
-      </w:pPr>
-      <w:r>
-        <w:t>So today I'm going to break down ZoomInfo versus hiring an outbound agency, specifically for branded merch companies. Which one actually makes sense for you? Because the answer depends a lot on your size and where you're at.</w:t>
+        <w:t>So today I want to break down both options honestly. What ZoomInfo actually is, what an outbound agency actually does, the pros and cons of each, and then which one makes sense depending on your company size.</w:t>
       </w:r>
     </w:p>
     <w:p>
@@ -93,7 +85,7 @@
           <w:color w:val="000000"/>
           <w:sz w:val="32"/>
         </w:rPr>
-        <w:t>What ZoomInfo Actually Gives You</w:t>
+        <w:t>What ZoomInfo Is</w:t>
       </w:r>
     </w:p>
     <w:p>
@@ -103,7 +95,7 @@
           <w:color w:val="969696"/>
           <w:sz w:val="18"/>
         </w:rPr>
-        <w:t>[0:30 - 3:00]</w:t>
+        <w:t>[0:25 - 2:30]</w:t>
       </w:r>
     </w:p>
     <w:p>
@@ -111,7 +103,7 @@
         <w:spacing w:after="160"/>
       </w:pPr>
       <w:r>
-        <w:t>So ZoomInfo is a B2B contact database. That's it. You pay for access to millions of contacts, filter by industry, company size, job title, location, and you export a spreadsheet of people to reach out to.</w:t>
+        <w:t>ZoomInfo is a B2B contact database. You pay for access to millions of contacts, filter by industry, company size, job title, location, and export a list of people to reach out to.</w:t>
       </w:r>
     </w:p>
     <w:p>
@@ -119,7 +111,7 @@
         <w:spacing w:after="160"/>
       </w:pPr>
       <w:r>
-        <w:t>And that's where it ends.</w:t>
+        <w:t>That's the product. Names, emails, phone numbers. You take that list and do the outreach yourself, whether that's cold calling, emailing from your CRM, or handing it to your sales team.</w:t>
       </w:r>
     </w:p>
     <w:p>
@@ -127,39 +119,7 @@
         <w:spacing w:after="160"/>
       </w:pPr>
       <w:r>
-        <w:t>You get names, emails, phone numbers. Some of them are accurate. A lot of them aren't. People change jobs constantly. Emails get deactivated. Your reps end up calling numbers that don't work and emailing people who left the company six months ago.</w:t>
-      </w:r>
-    </w:p>
-    <w:p>
-      <w:pPr>
-        <w:spacing w:after="160"/>
-      </w:pPr>
-      <w:r>
-        <w:t>I had a prospect tell me he spent $10,000 on a service that used ZoomInfo data. He went through the list and one of the contacts was literally dead. Another had sold their business years ago. Half the list was useless before they even started.</w:t>
-      </w:r>
-    </w:p>
-    <w:p>
-      <w:pPr>
-        <w:spacing w:after="160"/>
-      </w:pPr>
-      <w:r>
-        <w:t>Another one, a promo company in Georgia, sent 5,000 emails using ZoomInfo contacts and booked three meetings. Three. From five thousand emails. And that's not even counting what they paid for ZoomInfo on top of the time their team spent setting everything up.</w:t>
-      </w:r>
-    </w:p>
-    <w:p>
-      <w:pPr>
-        <w:spacing w:after="160"/>
-      </w:pPr>
-      <w:r>
-        <w:t>So the data itself, even when it's decent, is just a starting point. It doesn't send the emails for you. It doesn't write the messaging. It doesn't find out which companies need promo right now versus eventually. It doesn't call leads when they respond. It doesn't book the meeting.</w:t>
-      </w:r>
-    </w:p>
-    <w:p>
-      <w:pPr>
-        <w:spacing w:after="160"/>
-      </w:pPr>
-      <w:r>
-        <w:t>You're paying premium pricing for a spreadsheet. The rest is on you.</w:t>
+        <w:t>The pricing sits around $15,000 to $30,000 a year depending on your plan and how many seats you need. For a lot of branded merch companies, that's a serious line item.</w:t>
       </w:r>
     </w:p>
     <w:p>
@@ -171,7 +131,7 @@
           <w:color w:val="000000"/>
           <w:sz w:val="32"/>
         </w:rPr>
-        <w:t>What An Outbound Agency Actually Does</w:t>
+        <w:t>What An Outbound Agency Is</w:t>
       </w:r>
     </w:p>
     <w:p>
@@ -181,7 +141,7 @@
           <w:color w:val="969696"/>
           <w:sz w:val="18"/>
         </w:rPr>
-        <w:t>[3:00 - 7:00]</w:t>
+        <w:t>[2:30 - 4:30]</w:t>
       </w:r>
     </w:p>
     <w:p>
@@ -189,7 +149,7 @@
         <w:spacing w:after="160"/>
       </w:pPr>
       <w:r>
-        <w:t>An outbound agency, at least a good one, handles the entire thing from research to booked meeting.</w:t>
+        <w:t>An outbound agency is a team you hire to handle your entire cold outreach operation. They build the prospect lists, set up the email infrastructure, write the messaging, send the emails, handle the replies, call the interested leads, and book meetings directly on your calendar.</w:t>
       </w:r>
     </w:p>
     <w:p>
@@ -197,7 +157,7 @@
         <w:spacing w:after="160"/>
       </w:pPr>
       <w:r>
-        <w:t>So what does that look like?</w:t>
+        <w:t>A good one will also do the upfront research. Analyzing your past clients to figure out which industries and company sizes are most likely to buy from you, finding buying signals like upcoming trade shows or hiring rounds that indicate someone needs promo right now, and building the list around that data instead of just pulling random contacts.</w:t>
       </w:r>
     </w:p>
     <w:p>
@@ -205,7 +165,7 @@
         <w:spacing w:after="160"/>
       </w:pPr>
       <w:r>
-        <w:t>First, the research. We're not just pulling contacts from a database. We're analyzing your past client data, figuring out which industries spent the most with you, what the buying patterns look like, what use cases drove those purchases. Was it trade shows? Employee onboarding kits? Corporate gifting? We find that out.</w:t>
+        <w:t>They'll also set up secondary domains and inboxes so your main domain never gets burned, warm everything up before launching, and use dedicated cold email tools instead of sending from HubSpot or Outlook.</w:t>
       </w:r>
     </w:p>
     <w:p>
@@ -213,55 +173,7 @@
         <w:spacing w:after="160"/>
       </w:pPr>
       <w:r>
-        <w:t>Then we find the trending products in those industries. What are tech companies buying right now? What are construction companies buying? Because when you reach out offering a specific Carhartt jacket for a construction company's new hire program, that gets a response. When you reach out saying "we do branded merch," that gets deleted.</w:t>
-      </w:r>
-    </w:p>
-    <w:p>
-      <w:pPr>
-        <w:spacing w:after="160"/>
-      </w:pPr>
-      <w:r>
-        <w:t>Then the prospect list. And this is where it gets interesting. We use tools that are cheaper and better than ZoomInfo. Prospeo has 230 million contacts. Apollo is another one. Ocean.io can find companies that look exactly like your best clients based on their actual website content. Data quality is comparable or better and costs a fraction of what you'd pay ZoomInfo.</w:t>
-      </w:r>
-    </w:p>
-    <w:p>
-      <w:pPr>
-        <w:spacing w:after="160"/>
-      </w:pPr>
-      <w:r>
-        <w:t>But we go further. We run AI agents across the entire list to find which companies have upcoming events, which ones are hiring, which ones just got funded, which ones are rebranding. So now we're not blasting 10,000 people. We're reaching the 500 that actually have a reason to buy promo in the next 30 to 60 days.</w:t>
-      </w:r>
-    </w:p>
-    <w:p>
-      <w:pPr>
-        <w:spacing w:after="160"/>
-      </w:pPr>
-      <w:r>
-        <w:t>Then the infrastructure. We set up 50 plus domains, a hundred inboxes, warm everything up for two weeks so that when we launch, emails hit the primary inbox, not spam. We use a dedicated cold email tool built for this. Not HubSpot. Not Outlook.</w:t>
-      </w:r>
-    </w:p>
-    <w:p>
-      <w:pPr>
-        <w:spacing w:after="160"/>
-      </w:pPr>
-      <w:r>
-        <w:t>Then messaging. I can't give you the exact copy we use, but the principle is the same across all our clients. Lead with a specific product idea. Tie it to their use case. Reference their buying signal. Position your company as a creative partner who brings ideas, not a vendor begging for a catalog review.</w:t>
-      </w:r>
-    </w:p>
-    <w:p>
-      <w:pPr>
-        <w:spacing w:after="160"/>
-      </w:pPr>
-      <w:r>
-        <w:t>Then when someone responds, we call them. Within minutes. We book the meeting. We send them case studies and a catalog before the call so they're warmed up and ready to have a real conversation by the time your salesperson gets on.</w:t>
-      </w:r>
-    </w:p>
-    <w:p>
-      <w:pPr>
-        <w:spacing w:after="160"/>
-      </w:pPr>
-      <w:r>
-        <w:t>Your salesperson just shows up to a meeting with someone who already knows your company, has seen your work, and has a real need. That's a completely different conversation than cold calling a ZoomInfo contact who doesn't pick up.</w:t>
+        <w:t>The cost varies. Most agencies in this space charge anywhere from $3,000 to $10,000 a month, usually with a minimum commitment of one to three months.</w:t>
       </w:r>
     </w:p>
     <w:p>
@@ -273,7 +185,7 @@
           <w:color w:val="000000"/>
           <w:sz w:val="32"/>
         </w:rPr>
-        <w:t>Why The Data Alone Doesn't Work</w:t>
+        <w:t>Pros and Cons of ZoomInfo</w:t>
       </w:r>
     </w:p>
     <w:p>
@@ -283,7 +195,7 @@
           <w:color w:val="969696"/>
           <w:sz w:val="18"/>
         </w:rPr>
-        <w:t>[7:00 - 9:00]</w:t>
+        <w:t>[4:30 - 7:30]</w:t>
       </w:r>
     </w:p>
     <w:p>
@@ -291,7 +203,7 @@
         <w:spacing w:after="160"/>
       </w:pPr>
       <w:r>
-        <w:t>I talk to branded merch companies every single week. Probably five to ten a week at this point. And the ones who tried ZoomInfo or similar tools almost always describe the same experience.</w:t>
+        <w:t>Starting with the pros.</w:t>
       </w:r>
     </w:p>
     <w:p>
@@ -299,7 +211,7 @@
         <w:spacing w:after="160"/>
       </w:pPr>
       <w:r>
-        <w:t>They export a list. Plug it into HubSpot or Outlook or sometimes literally a Word mail merge. Send the same email to everyone. Something like "we do branded merch, want to see our catalog?" And nothing happens.</w:t>
+        <w:t>You own the data. Once you export those contacts, they're yours. You can use them however you want, whenever you want, across any tool or platform.</w:t>
       </w:r>
     </w:p>
     <w:p>
@@ -307,7 +219,7 @@
         <w:spacing w:after="160"/>
       </w:pPr>
       <w:r>
-        <w:t>And they blame outbound. They say cold email doesn't work in this industry. It's all relationships. People already have vendors.</w:t>
+        <w:t>You have full control over what gets sent and when. Nobody is emailing prospects on your behalf using messaging you haven't approved. If brand control matters to you, and in promo it usually does, that's a real benefit.</w:t>
       </w:r>
     </w:p>
     <w:p>
@@ -315,7 +227,7 @@
         <w:spacing w:after="160"/>
       </w:pPr>
       <w:r>
-        <w:t>But that's not what happened. What happened is they took a raw list with no buying signals, sent a generic message with no specific offer, from an email infrastructure that wasn't built for cold outreach, and it all landed in spam. Or if it didn't land in spam, nobody cared because the message didn't speak to anything they needed.</w:t>
+        <w:t>It can be cheaper upfront than an agency if you already have a sales team that knows how to prospect. If your reps are disciplined and actually use the tool daily, you can get value from it.</w:t>
       </w:r>
     </w:p>
     <w:p>
@@ -323,7 +235,7 @@
         <w:spacing w:after="160"/>
       </w:pPr>
       <w:r>
-        <w:t>Having 10,000 contacts means nothing if you don't have a proper email infrastructure that can send at volume without burning your domain. You need messaging that positions you as a creative partner. You need buying signals that tell you which of those 10,000 actually need promo right now. And you need someone replying to interested leads within five minutes and booking the meeting while they're still warm.</w:t>
+        <w:t>And you can use it for more than just cold outreach. Enriching existing contacts, researching companies before meetings, keeping your CRM data fresh. There are secondary uses.</w:t>
       </w:r>
     </w:p>
     <w:p>
@@ -331,7 +243,39 @@
         <w:spacing w:after="160"/>
       </w:pPr>
       <w:r>
-        <w:t>ZoomInfo gives you step one out of ten. The agency gives you all ten.</w:t>
+        <w:t>Now the cons.</w:t>
+      </w:r>
+    </w:p>
+    <w:p>
+      <w:pPr>
+        <w:spacing w:after="160"/>
+      </w:pPr>
+      <w:r>
+        <w:t>The data quality isn't great. I've heard this from dozens of promo companies at this point. People change jobs, emails go dead, phone numbers disconnect. One prospect told me he went through a ZoomInfo list and found contacts who had retired, sold their business, or in one case literally passed away. That's an extreme example but the general problem is real. A lot of the data is stale.</w:t>
+      </w:r>
+    </w:p>
+    <w:p>
+      <w:pPr>
+        <w:spacing w:after="160"/>
+      </w:pPr>
+      <w:r>
+        <w:t>It gives you contacts but no system. You still need to figure out the email infrastructure, the messaging, the follow-up cadence, the deliverability, the calling, the booking. ZoomInfo handles none of that. If your team doesn't know how to run cold outreach properly, the data sits in a spreadsheet and nothing happens.</w:t>
+      </w:r>
+    </w:p>
+    <w:p>
+      <w:pPr>
+        <w:spacing w:after="160"/>
+      </w:pPr>
+      <w:r>
+        <w:t>I talked to a promo company that sent 5,000 emails from ZoomInfo contacts and booked three meetings. The issue wasn't the number of contacts. It was everything that came after. Generic messaging. No buying signals. Sent from their main domain through HubSpot. Most of it probably landed in spam.</w:t>
+      </w:r>
+    </w:p>
+    <w:p>
+      <w:pPr>
+        <w:spacing w:after="160"/>
+      </w:pPr>
+      <w:r>
+        <w:t>And it's expensive for what it is. There are newer B2B databases like Prospeo, Apollo, and Ocean.io that offer comparable or better data at a fraction of the cost. So even if you want a database, ZoomInfo might not be the best value anymore.</w:t>
       </w:r>
     </w:p>
     <w:p>
@@ -343,7 +287,7 @@
           <w:color w:val="000000"/>
           <w:sz w:val="32"/>
         </w:rPr>
-        <w:t>Why Your Sales Team Can't Fill The Gap</w:t>
+        <w:t>Pros and Cons of an Outbound Agency</w:t>
       </w:r>
     </w:p>
     <w:p>
@@ -353,7 +297,7 @@
           <w:color w:val="969696"/>
           <w:sz w:val="18"/>
         </w:rPr>
-        <w:t>[9:00 - 11:00]</w:t>
+        <w:t>[7:30 - 11:00]</w:t>
       </w:r>
     </w:p>
     <w:p>
@@ -361,7 +305,7 @@
         <w:spacing w:after="160"/>
       </w:pPr>
       <w:r>
-        <w:t>I know what some of you are thinking. Okay, so I'll buy the cheaper data tools myself, learn Smartlead, set up the domains, write the copy, and just have my sales team run it.</w:t>
+        <w:t>Pros first.</w:t>
       </w:r>
     </w:p>
     <w:p>
@@ -369,7 +313,7 @@
         <w:spacing w:after="160"/>
       </w:pPr>
       <w:r>
-        <w:t>Your sales reps have become account managers. I say this on every call and every single prospect agrees with me. They service existing clients, handle reorders, follow up on quotes. At some point they stopped reaching out to anyone new.</w:t>
+        <w:t>It's fully done for you. You don't build lists, set up domains, write copy, manage campaigns, or chase replies. Your team just takes meetings with people who already expressed interest and have a real need. For a company where the sales reps are already stretched thin managing existing accounts, this is the biggest benefit.</w:t>
       </w:r>
     </w:p>
     <w:p>
@@ -377,7 +321,7 @@
         <w:spacing w:after="160"/>
       </w:pPr>
       <w:r>
-        <w:t>It makes sense from their side. Managing accounts is comfortable. Commissions still come in. Nobody's tracking how many new conversations they're starting each week.</w:t>
+        <w:t>A specialized agency already knows what works. If they focus on promo, they've already tested the messaging angles, they know which industries respond, they know what products to offer, they know what buying signals to look for. There's no three-month testing phase. They plug you into a system that's already producing results for similar companies.</w:t>
       </w:r>
     </w:p>
     <w:p>
@@ -385,7 +329,7 @@
         <w:spacing w:after="160"/>
       </w:pPr>
       <w:r>
-        <w:t>Prospecting in 2026 is a completely different skill set. AI agents that find buying signals across thousands of companies. Email infrastructure with dozens of domains and warm-up protocols. Parallel dialers. Clay workflows. This stuff changes every few months. Your reps aren't going to learn it. They shouldn't have to. That's not their job.</w:t>
+        <w:t>They handle the technical side that most promo companies don't have the skills for. Setting up 50 domains with proper DNS records, warming up a hundred inboxes, managing deliverability, using AI to find buying signals across thousands of companies. This is a full-time job that requires very specific knowledge. Your marketing person or office manager shouldn't be expected to figure this out.</w:t>
       </w:r>
     </w:p>
     <w:p>
@@ -393,7 +337,7 @@
         <w:spacing w:after="160"/>
       </w:pPr>
       <w:r>
-        <w:t>Your marketing team is the other option people think of. But they're busy with the website, social media, trade shows, catalogs. They don't have the bandwidth to build and manage a cold outreach system that requires daily monitoring and constant optimization.</w:t>
+        <w:t>And the leads tend to be higher quality than what you'd generate doing it yourself with a raw database. Because the agency is filtering by buying signals, writing targeted messaging, and pre-qualifying responses before they ever hit your calendar.</w:t>
       </w:r>
     </w:p>
     <w:p>
@@ -401,7 +345,47 @@
         <w:spacing w:after="160"/>
       </w:pPr>
       <w:r>
-        <w:t>You can try to hire for it. Good luck finding someone who understands AI tools, cold email deliverability, AND the branded merch industry. I've spent years building a team that can do this and it's still not easy.</w:t>
+        <w:t>Now the cons. And I want to be honest about these because they're real.</w:t>
+      </w:r>
+    </w:p>
+    <w:p>
+      <w:pPr>
+        <w:spacing w:after="160"/>
+      </w:pPr>
+      <w:r>
+        <w:t>You're giving up some control. Someone else is emailing prospects with your company name. If the messaging is off, if the tone doesn't match your brand, if they reach out to a company you already work with, that reflects on you. A good agency will let you approve everything and will maintain a do-not-contact list. But it's still a level of trust you have to be comfortable with.</w:t>
+      </w:r>
+    </w:p>
+    <w:p>
+      <w:pPr>
+        <w:spacing w:after="160"/>
+      </w:pPr>
+      <w:r>
+        <w:t>It costs more per month than a database subscription. You're paying for a team of people, not just access to data. For smaller companies, that monthly fee can be hard to justify, especially in the first couple months before the leads start converting into revenue.</w:t>
+      </w:r>
+    </w:p>
+    <w:p>
+      <w:pPr>
+        <w:spacing w:after="160"/>
+      </w:pPr>
+      <w:r>
+        <w:t>Results aren't instant in terms of closed deals. You'll likely see meetings booked within the first couple weeks. But the sales cycle in promo is long. Someone might hop on a call, love your stuff, and not place their first order for three to six months. So the ROI takes time to show up on the P&amp;L even if the system is working.</w:t>
+      </w:r>
+    </w:p>
+    <w:p>
+      <w:pPr>
+        <w:spacing w:after="160"/>
+      </w:pPr>
+      <w:r>
+        <w:t>Not all agencies are good. Most of them, honestly, are bad. If they don't specialize in promo, they'll spend months testing strategies that don't fit the industry. If they lock you into a twelve-month contract before proving anything, that's a red flag. If they can't show you real case studies with qualified meetings booked for companies like yours, move on.</w:t>
+      </w:r>
+    </w:p>
+    <w:p>
+      <w:pPr>
+        <w:spacing w:after="160"/>
+      </w:pPr>
+      <w:r>
+        <w:t>And there's the conflict of interest question. If the agency works with other promo companies, you need to make sure they're not reaching the same prospects on behalf of your competitors. Any agency worth working with will de-duplicate leads across clients and be transparent about how they handle this.</w:t>
       </w:r>
     </w:p>
     <w:p>
@@ -413,7 +397,7 @@
           <w:color w:val="000000"/>
           <w:sz w:val="32"/>
         </w:rPr>
-        <w:t>Which One Is Right For Your Company</w:t>
+        <w:t>Who Each One Is Best For</w:t>
       </w:r>
     </w:p>
     <w:p>
@@ -431,7 +415,7 @@
         <w:spacing w:after="160"/>
       </w:pPr>
       <w:r>
-        <w:t>Alright so this is where I want to be genuinely fair because it's not the same answer for everyone.</w:t>
+        <w:t>If you're a smaller promo company, under two million in revenue, and you have someone on your team who's willing to put in the work, a database makes sense. Not ZoomInfo though. Apollo or Prospeo will give you solid data for a tenth of the price. Learn a tool like Smartlead for sending. Set up your own domains. Write your own copy. You'll make mistakes and it'll take a few months, but at that size the budget might not be there for a full agency engagement. The DIY route is the move until you can afford to invest in a partner.</w:t>
       </w:r>
     </w:p>
     <w:p>
@@ -439,7 +423,7 @@
         <w:spacing w:after="160"/>
       </w:pPr>
       <w:r>
-        <w:t>If you're under two million in revenue, and you have one or two people who are willing to grind, you can probably get by with a cheaper database and doing outreach yourself. Apollo, Prospeo, either one works. Learn a tool like Smartlead. Set up your own infrastructure. Write your own copy. You'll make mistakes, it'll take a few months to figure out, but if you can't invest in a partner yet, that's the path. Just cancel ZoomInfo. You're overpaying for what you're getting.</w:t>
+        <w:t>If you're between roughly two million and a hundred million, an outbound agency is probably the better investment. And this is where I think the case is strongest.</w:t>
       </w:r>
     </w:p>
     <w:p>
@@ -447,7 +431,7 @@
         <w:spacing w:after="160"/>
       </w:pPr>
       <w:r>
-        <w:t>If you're between two million and roughly a hundred million, this is where an outbound agency wins and it's not even close. And yes I'm biased because that's exactly what we do. But the logic is pretty straightforward.</w:t>
+        <w:t>At this size, your sales reps have almost certainly become account managers. They handle reorders, service existing clients, follow up on quotes. They're not prospecting. You might tell them to, but it won't stick. Prospecting is a different skill than closing, and the modern tools required to do it well change every few months.</w:t>
       </w:r>
     </w:p>
     <w:p>
@@ -455,7 +439,7 @@
         <w:spacing w:after="160"/>
       </w:pPr>
       <w:r>
-        <w:t>You're big enough that the investment makes sense. You have real revenue, real clients, a real reputation. But you're not so big that you have fifteen people on your go-to-market team who can build this internally. Your reps are managing accounts. Your marketing team is stretched. And every month you don't have a system bringing in new business, you're just depending on referrals and hoping the phone rings.</w:t>
+        <w:t>Your marketing team is also not the answer. They're managing the website, trade shows, social media, catalogs. Building and running a cold outreach system that requires daily attention is a full-time role. They can't absorb that on top of everything else.</w:t>
       </w:r>
     </w:p>
     <w:p>
@@ -463,7 +447,7 @@
         <w:spacing w:after="160"/>
       </w:pPr>
       <w:r>
-        <w:t>A specialized outbound agency already knows what works in your space. We don't need three months to test. We know which industries respond. We know what products to offer. We know what buying signals matter. We can plug you into a proven system and get you results from the first week. We did it for a client recently, 19 qualified leads in their first week. Another one, 15 hospital meetings in three weeks. This stuff just works when the system is dialed in.</w:t>
+        <w:t>You could try to hire someone internally for this. Finding a person who understands AI-powered prospecting tools, cold email deliverability, AND the branded merch industry is extremely difficult. That person barely exists. An agency that already specializes in promo gives you that expertise immediately without the hiring risk.</w:t>
       </w:r>
     </w:p>
     <w:p>
@@ -471,7 +455,15 @@
         <w:spacing w:after="160"/>
       </w:pPr>
       <w:r>
-        <w:t>If you're above a hundred million, you probably already have internal marketing teams, demand gen people, maybe SDR teams. You might still benefit from a partner for specific campaigns or to test new markets. We work with companies like Swag.com and Imprint Engine which are not small. They chose to work with us because of the specialization. We only do branded merch outbound. That expertise is hard to replicate internally even with a big team. But at that level you have options that a ten million dollar company doesn't.</w:t>
+        <w:t>And at this revenue level, the math works. If an agency books you 15 to 20 qualified meetings a month and you close even a couple of those into accounts that spend $50,000 to $100,000 a year, the return pays for the service many times over. The issue is never the cost. It's whether the agency can actually deliver. That's why specialization matters so much.</w:t>
+      </w:r>
+    </w:p>
+    <w:p>
+      <w:pPr>
+        <w:spacing w:after="160"/>
+      </w:pPr>
+      <w:r>
+        <w:t>If you're above a hundred million, you probably have internal teams that can handle parts of this. Marketing departments, SDR teams, demand gen people. You might still benefit from an outbound partner for specific campaigns or entering new markets, but you have the resources to build some of this in-house if you want to. At that scale it becomes more of a strategic choice than a necessity.</w:t>
       </w:r>
     </w:p>
     <w:p>
@@ -483,7 +475,7 @@
           <w:color w:val="000000"/>
           <w:sz w:val="32"/>
         </w:rPr>
-        <w:t>If You Go The Agency Route, Here's What To Look For</w:t>
+        <w:t>If You Go The Agency Route</w:t>
       </w:r>
     </w:p>
     <w:p>
@@ -493,7 +485,7 @@
           <w:color w:val="969696"/>
           <w:sz w:val="18"/>
         </w:rPr>
-        <w:t>[14:00 - 16:00]</w:t>
+        <w:t>[14:00 - 15:30]</w:t>
       </w:r>
     </w:p>
     <w:p>
@@ -501,7 +493,7 @@
         <w:spacing w:after="160"/>
       </w:pPr>
       <w:r>
-        <w:t>If you decide a partner is the right move, please don't just pick the first one that cold calls you. Most lead gen agencies are terrible. I say that as someone who runs one.</w:t>
+        <w:t>Quick criteria because most agencies will waste your money.</w:t>
       </w:r>
     </w:p>
     <w:p>
@@ -509,7 +501,7 @@
         <w:spacing w:after="160"/>
       </w:pPr>
       <w:r>
-        <w:t>They should specialize in your industry. If they work with dentists, lawyers, SaaS companies, and also promo, they don't understand your market. They're going to spend months testing angles that someone who lives in this space already knows don't work. An agency that only does promo gets you results from week one because they already ran the same campaign for other companies like yours.</w:t>
+        <w:t>They should specialize in your industry. If they work with dentists and SaaS companies on the side, they don't understand promo. They're going to spend months testing what a specialized agency already knows.</w:t>
       </w:r>
     </w:p>
     <w:p>
@@ -517,7 +509,7 @@
         <w:spacing w:after="160"/>
       </w:pPr>
       <w:r>
-        <w:t>They should show you real case studies. Not "we sent 50,000 emails." Nobody cares about that. How many qualified meetings did you book? What companies showed up on the call? What did they end up closing? Those are the numbers that matter.</w:t>
+        <w:t>They should show you real results. Not email volume. Qualified meetings booked for companies similar to yours. Revenue generated. Actual proof.</w:t>
       </w:r>
     </w:p>
     <w:p>
@@ -525,7 +517,7 @@
         <w:spacing w:after="160"/>
       </w:pPr>
       <w:r>
-        <w:t>They should handle the full funnel. If they're just giving you a list and saying good luck, that's ZoomInfo with a markup. You want someone who does the research, builds the infrastructure, writes the messaging, handles the replies, calls the leads, books the meetings, and nurtures before the call. The whole thing.</w:t>
+        <w:t>They should handle the full funnel. Research, infrastructure, messaging, replies, calling, booking, nurturing. If they just hand you a list of interested people and say good luck, that's ZoomInfo with a markup.</w:t>
       </w:r>
     </w:p>
     <w:p>
@@ -533,7 +525,15 @@
         <w:spacing w:after="160"/>
       </w:pPr>
       <w:r>
-        <w:t>And they should offer a short enough commitment that you can see results before you've spent a fortune. If someone wants twelve months upfront before you've seen a single meeting, walk away.</w:t>
+        <w:t>Short commitment. You should be able to see results within the first month before you've committed to a full year.</w:t>
+      </w:r>
+    </w:p>
+    <w:p>
+      <w:pPr>
+        <w:spacing w:after="160"/>
+      </w:pPr>
+      <w:r>
+        <w:t>And they should be transparent about how they handle multiple clients in the same industry. Ask them directly.</w:t>
       </w:r>
     </w:p>
     <w:p>
@@ -555,7 +555,7 @@
           <w:color w:val="969696"/>
           <w:sz w:val="18"/>
         </w:rPr>
-        <w:t>[16:00 - 16:30]</w:t>
+        <w:t>[15:30 - 16:00]</w:t>
       </w:r>
     </w:p>
     <w:p>
@@ -563,7 +563,7 @@
         <w:spacing w:after="160"/>
       </w:pPr>
       <w:r>
-        <w:t>So that's the full breakdown. ZoomInfo gives you contacts. An outbound agency gives you meetings. For branded merch companies in that two to hundred million range, it's really not a debate.</w:t>
+        <w:t>So that's the honest breakdown. ZoomInfo gives you contacts. An outbound agency gives you meetings. Both have their place depending on where you are as a company.</w:t>
       </w:r>
     </w:p>
     <w:p>
@@ -571,7 +571,7 @@
         <w:spacing w:after="160"/>
       </w:pPr>
       <w:r>
-        <w:t>If you want my team to build and run this for your company, there's a link in the description to book a call and we'll walk you through how it would work for your specific market.</w:t>
+        <w:t>If you want to see how an outbound system would work for your specific branded merch company, there's a link in the description to book a call.</w:t>
       </w:r>
     </w:p>
     <w:p>

</xml_diff>

<commit_message>
Update YT script: talking points, multi-channel, linear flow, agency criteria
https://claude.ai/code/session_01UCsqcSBVJHQqXEgMPyvNno
</commit_message>
<xml_diff>
--- a/scripts/zoominfo-vs-outbound-agency-script.docx
+++ b/scripts/zoominfo-vs-outbound-agency-script.docx
@@ -57,7 +57,7 @@
         <w:spacing w:after="160"/>
       </w:pPr>
       <w:r>
-        <w:t>My agency has booked almost 500 sales meetings for branded merch companies in the past three months using cold outbound. I've also had clients come to me after spending $15,000 to $30,000 a year on ZoomInfo and getting almost nothing from it.</w:t>
+        <w:t>My agency has booked almost 500 sales meetings for branded merch companies in the past three months. Including getting leads from HubSpot, Hilton, Uber, Stripe, and Charter Communications, which is a $50 billion enterprise.</w:t>
       </w:r>
     </w:p>
     <w:p>
@@ -65,7 +65,15 @@
         <w:spacing w:after="160"/>
       </w:pPr>
       <w:r>
-        <w:t>So today I want to break down both options honestly. What ZoomInfo actually is, what an outbound agency actually does, the pros and cons of each, and then which one makes sense depending on your company size.</w:t>
+        <w:t>I've also had clients come to me after spending $15,000 to $30,000 a year on ZoomInfo and getting almost nothing from it.</w:t>
+      </w:r>
+    </w:p>
+    <w:p>
+      <w:pPr>
+        <w:spacing w:after="160"/>
+      </w:pPr>
+      <w:r>
+        <w:t>So today I'm going to break down both options honestly. What each one is, the pros and cons, and which one makes sense depending on your company size.</w:t>
       </w:r>
     </w:p>
     <w:p>
@@ -95,31 +103,67 @@
           <w:color w:val="969696"/>
           <w:sz w:val="18"/>
         </w:rPr>
-        <w:t>[0:25 - 2:30]</w:t>
+        <w:t>[0:25 - 2:00]</w:t>
       </w:r>
     </w:p>
     <w:p>
       <w:pPr>
-        <w:spacing w:after="160"/>
+        <w:spacing w:after="120"/>
       </w:pPr>
       <w:r>
-        <w:t>ZoomInfo is a B2B contact database. You pay for access to millions of contacts, filter by industry, company size, job title, location, and export a list of people to reach out to.</w:t>
+        <w:rPr>
+          <w:b/>
+          <w:color w:val="646464"/>
+        </w:rPr>
+        <w:t xml:space="preserve">&gt;&gt; </w:t>
+      </w:r>
+      <w:r>
+        <w:t>ZoomInfo is a B2B contact database. You pay for access to millions of contacts, filter by industry, company size, job title, location, and export a list.</w:t>
       </w:r>
     </w:p>
     <w:p>
       <w:pPr>
-        <w:spacing w:after="160"/>
+        <w:spacing w:after="120"/>
       </w:pPr>
       <w:r>
-        <w:t>That's the product. Names, emails, phone numbers. You take that list and do the outreach yourself, whether that's cold calling, emailing from your CRM, or handing it to your sales team.</w:t>
+        <w:rPr>
+          <w:b/>
+          <w:color w:val="646464"/>
+        </w:rPr>
+        <w:t xml:space="preserve">&gt;&gt; </w:t>
+      </w:r>
+      <w:r>
+        <w:t>That's the product. Names, emails, phone numbers. You take that list and do the outreach yourself.</w:t>
       </w:r>
     </w:p>
     <w:p>
       <w:pPr>
-        <w:spacing w:after="160"/>
+        <w:spacing w:after="120"/>
       </w:pPr>
       <w:r>
-        <w:t>The pricing sits around $15,000 to $30,000 a year depending on your plan and how many seats you need. For a lot of branded merch companies, that's a serious line item.</w:t>
+        <w:rPr>
+          <w:b/>
+          <w:color w:val="646464"/>
+        </w:rPr>
+        <w:t xml:space="preserve">&gt;&gt; </w:t>
+      </w:r>
+      <w:r>
+        <w:t>Pricing is around $15K-$30K a year depending on plan and seats. For a lot of branded merch companies that's a serious line item.</w:t>
+      </w:r>
+    </w:p>
+    <w:p>
+      <w:pPr>
+        <w:spacing w:after="120"/>
+      </w:pPr>
+      <w:r>
+        <w:rPr>
+          <w:b/>
+          <w:color w:val="646464"/>
+        </w:rPr>
+        <w:t xml:space="preserve">&gt;&gt; </w:t>
+      </w:r>
+      <w:r>
+        <w:t>It doesn't send the emails. Doesn't write the messaging. Doesn't call the leads. Doesn't book the meeting. You get data and the rest is on you.</w:t>
       </w:r>
     </w:p>
     <w:p>
@@ -131,7 +175,7 @@
           <w:color w:val="000000"/>
           <w:sz w:val="32"/>
         </w:rPr>
-        <w:t>What An Outbound Agency Is</w:t>
+        <w:t>What An Outbound Agency Does</w:t>
       </w:r>
     </w:p>
     <w:p>
@@ -141,7 +185,7 @@
           <w:color w:val="969696"/>
           <w:sz w:val="18"/>
         </w:rPr>
-        <w:t>[2:30 - 4:30]</w:t>
+        <w:t>[2:00 - 5:00]</w:t>
       </w:r>
     </w:p>
     <w:p>
@@ -149,7 +193,82 @@
         <w:spacing w:after="160"/>
       </w:pPr>
       <w:r>
-        <w:t>An outbound agency is a team you hire to handle your entire cold outreach operation. They build the prospect lists, set up the email infrastructure, write the messaging, send the emails, handle the replies, call the interested leads, and book meetings directly on your calendar.</w:t>
+        <w:t>Walk through this linearly from start to finish:</w:t>
+      </w:r>
+    </w:p>
+    <w:p>
+      <w:pPr>
+        <w:spacing w:after="120"/>
+      </w:pPr>
+      <w:r>
+        <w:rPr>
+          <w:b/>
+          <w:color w:val="646464"/>
+        </w:rPr>
+        <w:t xml:space="preserve">&gt;&gt; </w:t>
+      </w:r>
+      <w:r>
+        <w:t>RESEARCH: They start by analyzing your past clients. Which industries spent the most, what company sizes, what use cases drove those purchases. Trade shows? Onboarding kits? Corporate gifting? They find the pattern in who bought from you repeatedly and spent the most.</w:t>
+      </w:r>
+    </w:p>
+    <w:p>
+      <w:pPr>
+        <w:spacing w:after="120"/>
+      </w:pPr>
+      <w:r>
+        <w:rPr>
+          <w:b/>
+          <w:color w:val="646464"/>
+        </w:rPr>
+        <w:t xml:space="preserve">&gt;&gt; </w:t>
+      </w:r>
+      <w:r>
+        <w:t>TRENDING PRODUCTS: Then they research what products are trending in those industries right now. So when they reach out on your behalf, they're offering a specific Carhartt jacket or Yeti Rambler, not 'we do branded merch.'</w:t>
+      </w:r>
+    </w:p>
+    <w:p>
+      <w:pPr>
+        <w:spacing w:after="120"/>
+      </w:pPr>
+      <w:r>
+        <w:rPr>
+          <w:b/>
+          <w:color w:val="646464"/>
+        </w:rPr>
+        <w:t xml:space="preserve">&gt;&gt; </w:t>
+      </w:r>
+      <w:r>
+        <w:t>LIST BUILDING: They build the prospect list using B2B databases. Usually cheaper and better ones than ZoomInfo like Prospeo or Apollo.</w:t>
+      </w:r>
+    </w:p>
+    <w:p>
+      <w:pPr>
+        <w:spacing w:after="120"/>
+      </w:pPr>
+      <w:r>
+        <w:rPr>
+          <w:b/>
+          <w:color w:val="646464"/>
+        </w:rPr>
+        <w:t xml:space="preserve">&gt;&gt; </w:t>
+      </w:r>
+      <w:r>
+        <w:t>BUYING SIGNALS: Then they run AI agents across the entire list to find which companies have upcoming events, which ones are hiring in bulk, which ones just got funded, which ones opened a new office. So they're only reaching the companies that actually have a reason to buy promo right now. Not blasting 10,000 random contacts.</w:t>
+      </w:r>
+    </w:p>
+    <w:p>
+      <w:pPr>
+        <w:spacing w:after="120"/>
+      </w:pPr>
+      <w:r>
+        <w:rPr>
+          <w:b/>
+          <w:color w:val="646464"/>
+        </w:rPr>
+        <w:t xml:space="preserve">&gt;&gt; </w:t>
+      </w:r>
+      <w:r>
+        <w:t>INFRASTRUCTURE: They set up the entire infrastructure for doing outreach at scale across multiple channels.</w:t>
       </w:r>
     </w:p>
     <w:p>
@@ -157,7 +276,7 @@
         <w:spacing w:after="160"/>
       </w:pPr>
       <w:r>
-        <w:t>A good one will also do the upfront research. Analyzing your past clients to figure out which industries and company sizes are most likely to buy from you, finding buying signals like upcoming trade shows or hiring rounds that indicate someone needs promo right now, and building the list around that data instead of just pulling random contacts.</w:t>
+        <w:t>For email: setting up 50+ secondary domains, a hundred inboxes, warming everything up with AI for two weeks so Google and Outlook trust the accounts. Using a dedicated cold email tool, not HubSpot or Outlook.</w:t>
       </w:r>
     </w:p>
     <w:p>
@@ -165,7 +284,7 @@
         <w:spacing w:after="160"/>
       </w:pPr>
       <w:r>
-        <w:t>They'll also set up secondary domains and inboxes so your main domain never gets burned, warm everything up before launching, and use dedicated cold email tools instead of sending from HubSpot or Outlook.</w:t>
+        <w:t>For LinkedIn: setting up multiple accounts, connecting an automation tool that sends personalized connection requests and messages at volume.</w:t>
       </w:r>
     </w:p>
     <w:p>
@@ -173,7 +292,67 @@
         <w:spacing w:after="160"/>
       </w:pPr>
       <w:r>
-        <w:t>The cost varies. Most agencies in this space charge anywhere from $3,000 to $10,000 a month, usually with a minimum commitment of one to three months.</w:t>
+        <w:t>For cold calling: getting a power dialer set up and optimizing for high connection rates with AI voicemail detection, area code matching so your number looks local, and auto-skipping dead lines.</w:t>
+      </w:r>
+    </w:p>
+    <w:p>
+      <w:pPr>
+        <w:spacing w:after="120"/>
+      </w:pPr>
+      <w:r>
+        <w:rPr>
+          <w:b/>
+          <w:color w:val="646464"/>
+        </w:rPr>
+        <w:t xml:space="preserve">&gt;&gt; </w:t>
+      </w:r>
+      <w:r>
+        <w:t>MESSAGING: They write the outreach copy. Specific product ideas tied to the prospect's use case and buying signal. Positioned as a creative partner, not a vendor asking them to browse a catalog.</w:t>
+      </w:r>
+    </w:p>
+    <w:p>
+      <w:pPr>
+        <w:spacing w:after="120"/>
+      </w:pPr>
+      <w:r>
+        <w:rPr>
+          <w:b/>
+          <w:color w:val="646464"/>
+        </w:rPr>
+        <w:t xml:space="preserve">&gt;&gt; </w:t>
+      </w:r>
+      <w:r>
+        <w:t>LEAD MANAGEMENT: When someone responds positively, the agency handles the back and forth. They call interested leads within minutes, qualify them, and book the meeting directly on your salesperson's calendar.</w:t>
+      </w:r>
+    </w:p>
+    <w:p>
+      <w:pPr>
+        <w:spacing w:after="120"/>
+      </w:pPr>
+      <w:r>
+        <w:rPr>
+          <w:b/>
+          <w:color w:val="646464"/>
+        </w:rPr>
+        <w:t xml:space="preserve">&gt;&gt; </w:t>
+      </w:r>
+      <w:r>
+        <w:t>NURTURING: Before the meeting, they send the prospect case studies, a catalog, social proof. So by the time your salesperson gets on the call, the prospect already knows your company and is ready to have a real conversation.</w:t>
+      </w:r>
+    </w:p>
+    <w:p>
+      <w:pPr>
+        <w:spacing w:after="120"/>
+      </w:pPr>
+      <w:r>
+        <w:rPr>
+          <w:b/>
+          <w:color w:val="646464"/>
+        </w:rPr>
+        <w:t xml:space="preserve">&gt;&gt; </w:t>
+      </w:r>
+      <w:r>
+        <w:t>Your salesperson just shows up and closes. That's the entire value chain from research to closed deal.</w:t>
       </w:r>
     </w:p>
     <w:p>
@@ -195,7 +374,7 @@
           <w:color w:val="969696"/>
           <w:sz w:val="18"/>
         </w:rPr>
-        <w:t>[4:30 - 7:30]</w:t>
+        <w:t>[5:00 - 7:30]</w:t>
       </w:r>
     </w:p>
     <w:p>
@@ -203,7 +382,67 @@
         <w:spacing w:after="160"/>
       </w:pPr>
       <w:r>
-        <w:t>Starting with the pros.</w:t>
+        <w:t>Pros:</w:t>
+      </w:r>
+    </w:p>
+    <w:p>
+      <w:pPr>
+        <w:spacing w:after="120"/>
+      </w:pPr>
+      <w:r>
+        <w:rPr>
+          <w:b/>
+          <w:color w:val="646464"/>
+        </w:rPr>
+        <w:t xml:space="preserve">&gt;&gt; </w:t>
+      </w:r>
+      <w:r>
+        <w:t>You own the data. Export the contacts, they're yours forever, use them across any tool.</w:t>
+      </w:r>
+    </w:p>
+    <w:p>
+      <w:pPr>
+        <w:spacing w:after="120"/>
+      </w:pPr>
+      <w:r>
+        <w:rPr>
+          <w:b/>
+          <w:color w:val="646464"/>
+        </w:rPr>
+        <w:t xml:space="preserve">&gt;&gt; </w:t>
+      </w:r>
+      <w:r>
+        <w:t>Full control over messaging and brand. Nobody is emailing prospects with your company name unless you're the one writing it.</w:t>
+      </w:r>
+    </w:p>
+    <w:p>
+      <w:pPr>
+        <w:spacing w:after="120"/>
+      </w:pPr>
+      <w:r>
+        <w:rPr>
+          <w:b/>
+          <w:color w:val="646464"/>
+        </w:rPr>
+        <w:t xml:space="preserve">&gt;&gt; </w:t>
+      </w:r>
+      <w:r>
+        <w:t>Can be cheaper than an agency IF you already have a sales team that knows how to prospect and set up infrastructure. Big if.</w:t>
+      </w:r>
+    </w:p>
+    <w:p>
+      <w:pPr>
+        <w:spacing w:after="120"/>
+      </w:pPr>
+      <w:r>
+        <w:rPr>
+          <w:b/>
+          <w:color w:val="646464"/>
+        </w:rPr>
+        <w:t xml:space="preserve">&gt;&gt; </w:t>
+      </w:r>
+      <w:r>
+        <w:t>Secondary uses beyond outreach: enriching CRM data, researching companies before meetings, keeping contact info fresh.</w:t>
       </w:r>
     </w:p>
     <w:p>
@@ -211,71 +450,67 @@
         <w:spacing w:after="160"/>
       </w:pPr>
       <w:r>
-        <w:t>You own the data. Once you export those contacts, they're yours. You can use them however you want, whenever you want, across any tool or platform.</w:t>
+        <w:t>Cons:</w:t>
       </w:r>
     </w:p>
     <w:p>
       <w:pPr>
-        <w:spacing w:after="160"/>
+        <w:spacing w:after="120"/>
       </w:pPr>
       <w:r>
-        <w:t>You have full control over what gets sent and when. Nobody is emailing prospects on your behalf using messaging you haven't approved. If brand control matters to you, and in promo it usually does, that's a real benefit.</w:t>
+        <w:rPr>
+          <w:b/>
+          <w:color w:val="646464"/>
+        </w:rPr>
+        <w:t xml:space="preserve">&gt;&gt; </w:t>
+      </w:r>
+      <w:r>
+        <w:t>Data quality is not great. People change jobs, emails go dead, numbers disconnect. One prospect told me he found contacts on ZoomInfo who had retired, sold their business, or passed away. Extreme example but the general problem is real. A lot of the data is stale.</w:t>
       </w:r>
     </w:p>
     <w:p>
       <w:pPr>
-        <w:spacing w:after="160"/>
+        <w:spacing w:after="120"/>
       </w:pPr>
       <w:r>
-        <w:t>It can be cheaper upfront than an agency if you already have a sales team that knows how to prospect. If your reps are disciplined and actually use the tool daily, you can get value from it.</w:t>
+        <w:rPr>
+          <w:b/>
+          <w:color w:val="646464"/>
+        </w:rPr>
+        <w:t xml:space="preserve">&gt;&gt; </w:t>
+      </w:r>
+      <w:r>
+        <w:t>It gives you contacts but zero system. You still need to figure out infrastructure, messaging, deliverability, follow-ups, calling, booking. If your team doesn't know how to run cold outreach, the data sits in a spreadsheet and nothing happens.</w:t>
       </w:r>
     </w:p>
     <w:p>
       <w:pPr>
-        <w:spacing w:after="160"/>
+        <w:spacing w:after="120"/>
       </w:pPr>
       <w:r>
-        <w:t>And you can use it for more than just cold outreach. Enriching existing contacts, researching companies before meetings, keeping your CRM data fresh. There are secondary uses.</w:t>
+        <w:rPr>
+          <w:b/>
+          <w:color w:val="646464"/>
+        </w:rPr>
+        <w:t xml:space="preserve">&gt;&gt; </w:t>
+      </w:r>
+      <w:r>
+        <w:t>Example: a promo company sent 5,000 emails from ZoomInfo contacts and booked 3 meetings. The data wasn't the problem. Generic messaging, no buying signals, sent from their main domain through HubSpot, most of it landed in spam.</w:t>
       </w:r>
     </w:p>
     <w:p>
       <w:pPr>
-        <w:spacing w:after="160"/>
+        <w:spacing w:after="120"/>
       </w:pPr>
       <w:r>
-        <w:t>Now the cons.</w:t>
+        <w:rPr>
+          <w:b/>
+          <w:color w:val="646464"/>
+        </w:rPr>
+        <w:t xml:space="preserve">&gt;&gt; </w:t>
       </w:r>
-    </w:p>
-    <w:p>
-      <w:pPr>
-        <w:spacing w:after="160"/>
-      </w:pPr>
       <w:r>
-        <w:t>The data quality isn't great. I've heard this from dozens of promo companies at this point. People change jobs, emails go dead, phone numbers disconnect. One prospect told me he went through a ZoomInfo list and found contacts who had retired, sold their business, or in one case literally passed away. That's an extreme example but the general problem is real. A lot of the data is stale.</w:t>
-      </w:r>
-    </w:p>
-    <w:p>
-      <w:pPr>
-        <w:spacing w:after="160"/>
-      </w:pPr>
-      <w:r>
-        <w:t>It gives you contacts but no system. You still need to figure out the email infrastructure, the messaging, the follow-up cadence, the deliverability, the calling, the booking. ZoomInfo handles none of that. If your team doesn't know how to run cold outreach properly, the data sits in a spreadsheet and nothing happens.</w:t>
-      </w:r>
-    </w:p>
-    <w:p>
-      <w:pPr>
-        <w:spacing w:after="160"/>
-      </w:pPr>
-      <w:r>
-        <w:t>I talked to a promo company that sent 5,000 emails from ZoomInfo contacts and booked three meetings. The issue wasn't the number of contacts. It was everything that came after. Generic messaging. No buying signals. Sent from their main domain through HubSpot. Most of it probably landed in spam.</w:t>
-      </w:r>
-    </w:p>
-    <w:p>
-      <w:pPr>
-        <w:spacing w:after="160"/>
-      </w:pPr>
-      <w:r>
-        <w:t>And it's expensive for what it is. There are newer B2B databases like Prospeo, Apollo, and Ocean.io that offer comparable or better data at a fraction of the cost. So even if you want a database, ZoomInfo might not be the best value anymore.</w:t>
+        <w:t>It's overpriced for what it is. Newer databases like Prospeo, Apollo, Ocean.io offer comparable or better data at a fraction of the cost. So even if you want a database, ZoomInfo might not be the best value.</w:t>
       </w:r>
     </w:p>
     <w:p>
@@ -305,7 +540,82 @@
         <w:spacing w:after="160"/>
       </w:pPr>
       <w:r>
-        <w:t>Pros first.</w:t>
+        <w:t>Pros:</w:t>
+      </w:r>
+    </w:p>
+    <w:p>
+      <w:pPr>
+        <w:spacing w:after="120"/>
+      </w:pPr>
+      <w:r>
+        <w:rPr>
+          <w:b/>
+          <w:color w:val="646464"/>
+        </w:rPr>
+        <w:t xml:space="preserve">&gt;&gt; </w:t>
+      </w:r>
+      <w:r>
+        <w:t>TIME: They save you massive amounts of time. Your team doesn't have to learn how to set up email infrastructure, configure domains, write cold outreach copy, manage campaigns daily. Someone who's done this thousands of times is going to set it up faster and better than someone learning from scratch.</w:t>
+      </w:r>
+    </w:p>
+    <w:p>
+      <w:pPr>
+        <w:spacing w:after="120"/>
+      </w:pPr>
+      <w:r>
+        <w:rPr>
+          <w:b/>
+          <w:color w:val="646464"/>
+        </w:rPr>
+        <w:t xml:space="preserve">&gt;&gt; </w:t>
+      </w:r>
+      <w:r>
+        <w:t>MONEY: They save you the wasted money you'd spend testing and failing on your own. Every bad campaign you run yourself costs you in burned domains, lost sender reputation, and months of no results. An agency that specializes in your space skips the testing phase because they already know what works.</w:t>
+      </w:r>
+    </w:p>
+    <w:p>
+      <w:pPr>
+        <w:spacing w:after="120"/>
+      </w:pPr>
+      <w:r>
+        <w:rPr>
+          <w:b/>
+          <w:color w:val="646464"/>
+        </w:rPr>
+        <w:t xml:space="preserve">&gt;&gt; </w:t>
+      </w:r>
+      <w:r>
+        <w:t>SKILL GAP: The knowledge required to run modern outbound changes every few months. AI tools, deliverability rules, new platforms. Your reps and marketing team aren't going to keep up with this. It's a full-time specialty.</w:t>
+      </w:r>
+    </w:p>
+    <w:p>
+      <w:pPr>
+        <w:spacing w:after="120"/>
+      </w:pPr>
+      <w:r>
+        <w:rPr>
+          <w:b/>
+          <w:color w:val="646464"/>
+        </w:rPr>
+        <w:t xml:space="preserve">&gt;&gt; </w:t>
+      </w:r>
+      <w:r>
+        <w:t>SCALE: The biggest one. Because your team is not spending time building and managing the outreach system, they now have time to handle MORE leads. You're not just getting leads with less work. You're freeing up your salespeople to actually sell. So you get more meetings AND your team has more bandwidth to close them. That compounds. That's how companies scale fast.</w:t>
+      </w:r>
+    </w:p>
+    <w:p>
+      <w:pPr>
+        <w:spacing w:after="120"/>
+      </w:pPr>
+      <w:r>
+        <w:rPr>
+          <w:b/>
+          <w:color w:val="646464"/>
+        </w:rPr>
+        <w:t xml:space="preserve">&gt;&gt; </w:t>
+      </w:r>
+      <w:r>
+        <w:t>A specialized agency knows what works in promo specifically. No three-month testing phase. They plug you into a proven system and you see results from week one.</w:t>
       </w:r>
     </w:p>
     <w:p>
@@ -313,79 +623,82 @@
         <w:spacing w:after="160"/>
       </w:pPr>
       <w:r>
-        <w:t>It's fully done for you. You don't build lists, set up domains, write copy, manage campaigns, or chase replies. Your team just takes meetings with people who already expressed interest and have a real need. For a company where the sales reps are already stretched thin managing existing accounts, this is the biggest benefit.</w:t>
+        <w:t>Cons:</w:t>
       </w:r>
     </w:p>
     <w:p>
       <w:pPr>
-        <w:spacing w:after="160"/>
+        <w:spacing w:after="120"/>
       </w:pPr>
       <w:r>
-        <w:t>A specialized agency already knows what works. If they focus on promo, they've already tested the messaging angles, they know which industries respond, they know what products to offer, they know what buying signals to look for. There's no three-month testing phase. They plug you into a system that's already producing results for similar companies.</w:t>
+        <w:rPr>
+          <w:b/>
+          <w:color w:val="646464"/>
+        </w:rPr>
+        <w:t xml:space="preserve">&gt;&gt; </w:t>
+      </w:r>
+      <w:r>
+        <w:t>You give up some control. Someone else is reaching prospects with your company name. If the messaging is off or the tone doesn't match your brand, it reflects on you. A good agency lets you approve everything, but it still requires trust.</w:t>
       </w:r>
     </w:p>
     <w:p>
       <w:pPr>
-        <w:spacing w:after="160"/>
+        <w:spacing w:after="120"/>
       </w:pPr>
       <w:r>
-        <w:t>They handle the technical side that most promo companies don't have the skills for. Setting up 50 domains with proper DNS records, warming up a hundred inboxes, managing deliverability, using AI to find buying signals across thousands of companies. This is a full-time job that requires very specific knowledge. Your marketing person or office manager shouldn't be expected to figure this out.</w:t>
+        <w:rPr>
+          <w:b/>
+          <w:color w:val="646464"/>
+        </w:rPr>
+        <w:t xml:space="preserve">&gt;&gt; </w:t>
+      </w:r>
+      <w:r>
+        <w:t>Higher monthly cost than a database subscription. You're paying for a team, not just data access. For smaller companies that fee can be hard to justify early on.</w:t>
       </w:r>
     </w:p>
     <w:p>
       <w:pPr>
-        <w:spacing w:after="160"/>
+        <w:spacing w:after="120"/>
       </w:pPr>
       <w:r>
-        <w:t>And the leads tend to be higher quality than what you'd generate doing it yourself with a raw database. Because the agency is filtering by buying signals, writing targeted messaging, and pre-qualifying responses before they ever hit your calendar.</w:t>
+        <w:rPr>
+          <w:b/>
+          <w:color w:val="646464"/>
+        </w:rPr>
+        <w:t xml:space="preserve">&gt;&gt; </w:t>
+      </w:r>
+      <w:r>
+        <w:t>Results in terms of closed deals aren't instant. You'll see meetings booked quickly, often in the first week or two. But the promo sales cycle is long. Someone might love your stuff on the call and not place their first order for three to six months. ROI takes time to show on the P&amp;L even when the system is working.</w:t>
       </w:r>
     </w:p>
     <w:p>
       <w:pPr>
-        <w:spacing w:after="160"/>
+        <w:spacing w:after="120"/>
       </w:pPr>
       <w:r>
-        <w:t>Now the cons. And I want to be honest about these because they're real.</w:t>
+        <w:rPr>
+          <w:b/>
+          <w:color w:val="646464"/>
+        </w:rPr>
+        <w:t xml:space="preserve">&gt;&gt; </w:t>
+      </w:r>
+      <w:r>
+        <w:t>Most agencies are bad. If they don't specialize in promo, they'll waste months. If they lock you into long contracts before proving anything, red flag. More on how to pick a good one in a second.</w:t>
       </w:r>
     </w:p>
     <w:p>
       <w:pPr>
-        <w:spacing w:after="160"/>
+        <w:spacing w:after="120"/>
       </w:pPr>
       <w:r>
-        <w:t>You're giving up some control. Someone else is emailing prospects with your company name. If the messaging is off, if the tone doesn't match your brand, if they reach out to a company you already work with, that reflects on you. A good agency will let you approve everything and will maintain a do-not-contact list. But it's still a level of trust you have to be comfortable with.</w:t>
+        <w:rPr>
+          <w:b/>
+          <w:color w:val="646464"/>
+        </w:rPr>
+        <w:t xml:space="preserve">&gt;&gt; </w:t>
       </w:r>
-    </w:p>
-    <w:p>
-      <w:pPr>
-        <w:spacing w:after="160"/>
-      </w:pPr>
       <w:r>
-        <w:t>It costs more per month than a database subscription. You're paying for a team of people, not just access to data. For smaller companies, that monthly fee can be hard to justify, especially in the first couple months before the leads start converting into revenue.</w:t>
-      </w:r>
-    </w:p>
-    <w:p>
-      <w:pPr>
-        <w:spacing w:after="160"/>
-      </w:pPr>
-      <w:r>
-        <w:t>Results aren't instant in terms of closed deals. You'll likely see meetings booked within the first couple weeks. But the sales cycle in promo is long. Someone might hop on a call, love your stuff, and not place their first order for three to six months. So the ROI takes time to show up on the P&amp;L even if the system is working.</w:t>
-      </w:r>
-    </w:p>
-    <w:p>
-      <w:pPr>
-        <w:spacing w:after="160"/>
-      </w:pPr>
-      <w:r>
-        <w:t>Not all agencies are good. Most of them, honestly, are bad. If they don't specialize in promo, they'll spend months testing strategies that don't fit the industry. If they lock you into a twelve-month contract before proving anything, that's a red flag. If they can't show you real case studies with qualified meetings booked for companies like yours, move on.</w:t>
-      </w:r>
-    </w:p>
-    <w:p>
-      <w:pPr>
-        <w:spacing w:after="160"/>
-      </w:pPr>
-      <w:r>
-        <w:t>And there's the conflict of interest question. If the agency works with other promo companies, you need to make sure they're not reaching the same prospects on behalf of your competitors. Any agency worth working with will de-duplicate leads across clients and be transparent about how they handle this.</w:t>
+        <w:t>Conflict of interest. If they work with other promo companies, you need to make sure they're not reaching the same prospects for your competitors.</w:t>
       </w:r>
     </w:p>
     <w:p>
@@ -415,7 +728,22 @@
         <w:spacing w:after="160"/>
       </w:pPr>
       <w:r>
-        <w:t>If you're a smaller promo company, under two million in revenue, and you have someone on your team who's willing to put in the work, a database makes sense. Not ZoomInfo though. Apollo or Prospeo will give you solid data for a tenth of the price. Learn a tool like Smartlead for sending. Set up your own domains. Write your own copy. You'll make mistakes and it'll take a few months, but at that size the budget might not be there for a full agency engagement. The DIY route is the move until you can afford to invest in a partner.</w:t>
+        <w:t>Under $2M in revenue:</w:t>
+      </w:r>
+    </w:p>
+    <w:p>
+      <w:pPr>
+        <w:spacing w:after="120"/>
+      </w:pPr>
+      <w:r>
+        <w:rPr>
+          <w:b/>
+          <w:color w:val="646464"/>
+        </w:rPr>
+        <w:t xml:space="preserve">&gt;&gt; </w:t>
+      </w:r>
+      <w:r>
+        <w:t>A database is probably the right move at this size. Not ZoomInfo though. Apollo or Prospeo for a tenth of the price. Learn Smartlead. Set up your own domains. Write your own copy. You'll make mistakes, takes a few months, but the budget might not be there for an agency yet.</w:t>
       </w:r>
     </w:p>
     <w:p>
@@ -423,7 +751,82 @@
         <w:spacing w:after="160"/>
       </w:pPr>
       <w:r>
-        <w:t>If you're between roughly two million and a hundred million, an outbound agency is probably the better investment. And this is where I think the case is strongest.</w:t>
+        <w:t>$2M to $100M in revenue:</w:t>
+      </w:r>
+    </w:p>
+    <w:p>
+      <w:pPr>
+        <w:spacing w:after="120"/>
+      </w:pPr>
+      <w:r>
+        <w:rPr>
+          <w:b/>
+          <w:color w:val="646464"/>
+        </w:rPr>
+        <w:t xml:space="preserve">&gt;&gt; </w:t>
+      </w:r>
+      <w:r>
+        <w:t>This is where an outbound agency wins clearly.</w:t>
+      </w:r>
+    </w:p>
+    <w:p>
+      <w:pPr>
+        <w:spacing w:after="120"/>
+      </w:pPr>
+      <w:r>
+        <w:rPr>
+          <w:b/>
+          <w:color w:val="646464"/>
+        </w:rPr>
+        <w:t xml:space="preserve">&gt;&gt; </w:t>
+      </w:r>
+      <w:r>
+        <w:t>Your sales reps have become account managers. They service existing clients, handle reorders, chase renewals. They're not prospecting and they won't start.</w:t>
+      </w:r>
+    </w:p>
+    <w:p>
+      <w:pPr>
+        <w:spacing w:after="120"/>
+      </w:pPr>
+      <w:r>
+        <w:rPr>
+          <w:b/>
+          <w:color w:val="646464"/>
+        </w:rPr>
+        <w:t xml:space="preserve">&gt;&gt; </w:t>
+      </w:r>
+      <w:r>
+        <w:t>Your marketing team is stretched across website, trade shows, social media, catalogs. They can't absorb running a daily outreach operation on top of everything else.</w:t>
+      </w:r>
+    </w:p>
+    <w:p>
+      <w:pPr>
+        <w:spacing w:after="120"/>
+      </w:pPr>
+      <w:r>
+        <w:rPr>
+          <w:b/>
+          <w:color w:val="646464"/>
+        </w:rPr>
+        <w:t xml:space="preserve">&gt;&gt; </w:t>
+      </w:r>
+      <w:r>
+        <w:t>The other option is hiring a go-to-market engineer internally. Someone who knows all the AI tools, the infrastructure, the messaging, the deliverability. That person is going to cost you above $10K a month in salary alone. Which is the same or more than an agency. Except the agency comes with the tools, the systems, the proven playbook, and a team. The internal hire comes with a learning curve and no guarantee they know your industry.</w:t>
+      </w:r>
+    </w:p>
+    <w:p>
+      <w:pPr>
+        <w:spacing w:after="120"/>
+      </w:pPr>
+      <w:r>
+        <w:rPr>
+          <w:b/>
+          <w:color w:val="646464"/>
+        </w:rPr>
+        <w:t xml:space="preserve">&gt;&gt; </w:t>
+      </w:r>
+      <w:r>
+        <w:t>At this revenue level the math works. If an agency books you 15-20 qualified meetings a month and you close even a couple into accounts spending $50K-$100K a year, the return pays for the service many times over.</w:t>
       </w:r>
     </w:p>
     <w:p>
@@ -431,39 +834,37 @@
         <w:spacing w:after="160"/>
       </w:pPr>
       <w:r>
-        <w:t>At this size, your sales reps have almost certainly become account managers. They handle reorders, service existing clients, follow up on quotes. They're not prospecting. You might tell them to, but it won't stick. Prospecting is a different skill than closing, and the modern tools required to do it well change every few months.</w:t>
+        <w:t>Above $100M in revenue:</w:t>
       </w:r>
     </w:p>
     <w:p>
       <w:pPr>
-        <w:spacing w:after="160"/>
+        <w:spacing w:after="120"/>
       </w:pPr>
       <w:r>
-        <w:t>Your marketing team is also not the answer. They're managing the website, trade shows, social media, catalogs. Building and running a cold outreach system that requires daily attention is a full-time role. They can't absorb that on top of everything else.</w:t>
+        <w:rPr>
+          <w:b/>
+          <w:color w:val="646464"/>
+        </w:rPr>
+        <w:t xml:space="preserve">&gt;&gt; </w:t>
+      </w:r>
+      <w:r>
+        <w:t>At this size you probably have internal marketing teams, SDR teams, demand gen people. Hiring a GTM engineer or building an internal outbound function makes more sense here because you have the budget and infrastructure to support it.</w:t>
       </w:r>
     </w:p>
     <w:p>
       <w:pPr>
-        <w:spacing w:after="160"/>
+        <w:spacing w:after="120"/>
       </w:pPr>
       <w:r>
-        <w:t>You could try to hire someone internally for this. Finding a person who understands AI-powered prospecting tools, cold email deliverability, AND the branded merch industry is extremely difficult. That person barely exists. An agency that already specializes in promo gives you that expertise immediately without the hiring risk.</w:t>
+        <w:rPr>
+          <w:b/>
+          <w:color w:val="646464"/>
+        </w:rPr>
+        <w:t xml:space="preserve">&gt;&gt; </w:t>
       </w:r>
-    </w:p>
-    <w:p>
-      <w:pPr>
-        <w:spacing w:after="160"/>
-      </w:pPr>
       <w:r>
-        <w:t>And at this revenue level, the math works. If an agency books you 15 to 20 qualified meetings a month and you close even a couple of those into accounts that spend $50,000 to $100,000 a year, the return pays for the service many times over. The issue is never the cost. It's whether the agency can actually deliver. That's why specialization matters so much.</w:t>
-      </w:r>
-    </w:p>
-    <w:p>
-      <w:pPr>
-        <w:spacing w:after="160"/>
-      </w:pPr>
-      <w:r>
-        <w:t>If you're above a hundred million, you probably have internal teams that can handle parts of this. Marketing departments, SDR teams, demand gen people. You might still benefit from an outbound partner for specific campaigns or entering new markets, but you have the resources to build some of this in-house if you want to. At that scale it becomes more of a strategic choice than a necessity.</w:t>
+        <w:t>You might still use an agency for specific campaigns or new markets. But you have options that a $10M company doesn't.</w:t>
       </w:r>
     </w:p>
     <w:p>
@@ -475,7 +876,7 @@
           <w:color w:val="000000"/>
           <w:sz w:val="32"/>
         </w:rPr>
-        <w:t>If You Go The Agency Route</w:t>
+        <w:t>How To Pick The Right Agency</w:t>
       </w:r>
     </w:p>
     <w:p>
@@ -490,50 +891,107 @@
     </w:p>
     <w:p>
       <w:pPr>
-        <w:spacing w:after="160"/>
+        <w:spacing w:after="120"/>
       </w:pPr>
       <w:r>
-        <w:t>Quick criteria because most agencies will waste your money.</w:t>
+        <w:rPr>
+          <w:b/>
+          <w:color w:val="646464"/>
+        </w:rPr>
+        <w:t xml:space="preserve">&gt;&gt; </w:t>
+      </w:r>
+      <w:r>
+        <w:t>They specialize in promo. Not dentists and SaaS on the side. Full promo specialization. If they don't know the industry, they're going to waste months testing angles that someone specialized already knows don't work.</w:t>
       </w:r>
     </w:p>
     <w:p>
       <w:pPr>
-        <w:spacing w:after="160"/>
+        <w:spacing w:after="120"/>
       </w:pPr>
       <w:r>
-        <w:t>They should specialize in your industry. If they work with dentists and SaaS companies on the side, they don't understand promo. They're going to spend months testing what a specialized agency already knows.</w:t>
+        <w:rPr>
+          <w:b/>
+          <w:color w:val="646464"/>
+        </w:rPr>
+        <w:t xml:space="preserve">&gt;&gt; </w:t>
+      </w:r>
+      <w:r>
+        <w:t>Short commitment. You should be able to see results within the first month. If they want 6-12 months upfront before proving anything, walk away.</w:t>
       </w:r>
     </w:p>
     <w:p>
       <w:pPr>
-        <w:spacing w:after="160"/>
+        <w:spacing w:after="120"/>
       </w:pPr>
       <w:r>
-        <w:t>They should show you real results. Not email volume. Qualified meetings booked for companies similar to yours. Revenue generated. Actual proof.</w:t>
+        <w:rPr>
+          <w:b/>
+          <w:color w:val="646464"/>
+        </w:rPr>
+        <w:t xml:space="preserve">&gt;&gt; </w:t>
+      </w:r>
+      <w:r>
+        <w:t>They guarantee a specific number of meetings, not just leads. Leads are vanity. Meetings are what fills your pipeline. They should be able to tell you exactly how many qualified meetings to expect.</w:t>
       </w:r>
     </w:p>
     <w:p>
       <w:pPr>
-        <w:spacing w:after="160"/>
+        <w:spacing w:after="120"/>
       </w:pPr>
       <w:r>
-        <w:t>They should handle the full funnel. Research, infrastructure, messaging, replies, calling, booking, nurturing. If they just hand you a list of interested people and say good luck, that's ZoomInfo with a markup.</w:t>
+        <w:rPr>
+          <w:b/>
+          <w:color w:val="646464"/>
+        </w:rPr>
+        <w:t xml:space="preserve">&gt;&gt; </w:t>
+      </w:r>
+      <w:r>
+        <w:t>The ROI should map out to at least 10x on your investment with them. If they can't walk you through this math on a call and show you exactly how the numbers work based on your average deal size, that's a red flag.</w:t>
       </w:r>
     </w:p>
     <w:p>
       <w:pPr>
-        <w:spacing w:after="160"/>
+        <w:spacing w:after="120"/>
       </w:pPr>
       <w:r>
-        <w:t>Short commitment. You should be able to see results within the first month before you've committed to a full year.</w:t>
+        <w:rPr>
+          <w:b/>
+          <w:color w:val="646464"/>
+        </w:rPr>
+        <w:t xml:space="preserve">&gt;&gt; </w:t>
+      </w:r>
+      <w:r>
+        <w:t>They have real case studies. Not 'we sent 50,000 emails.' Actual qualified meetings booked and deals closed for companies similar to yours.</w:t>
       </w:r>
     </w:p>
     <w:p>
       <w:pPr>
-        <w:spacing w:after="160"/>
+        <w:spacing w:after="120"/>
       </w:pPr>
       <w:r>
-        <w:t>And they should be transparent about how they handle multiple clients in the same industry. Ask them directly.</w:t>
+        <w:rPr>
+          <w:b/>
+          <w:color w:val="646464"/>
+        </w:rPr>
+        <w:t xml:space="preserve">&gt;&gt; </w:t>
+      </w:r>
+      <w:r>
+        <w:t>They should be a smaller, leaner team. Not a massive company that signs you up and hands you off to some random account manager. You want people who are heavily focused on your account and deeply specialized in what they do.</w:t>
+      </w:r>
+    </w:p>
+    <w:p>
+      <w:pPr>
+        <w:spacing w:after="120"/>
+      </w:pPr>
+      <w:r>
+        <w:rPr>
+          <w:b/>
+          <w:color w:val="646464"/>
+        </w:rPr>
+        <w:t xml:space="preserve">&gt;&gt; </w:t>
+      </w:r>
+      <w:r>
+        <w:t>They handle the full funnel. Research, infrastructure, messaging, replies, calling, booking, nurturing. If they just hand you interested leads and say good luck, that's ZoomInfo with a markup.</w:t>
       </w:r>
     </w:p>
     <w:p>
@@ -571,7 +1029,15 @@
         <w:spacing w:after="160"/>
       </w:pPr>
       <w:r>
-        <w:t>If you want to see how an outbound system would work for your specific branded merch company, there's a link in the description to book a call.</w:t>
+        <w:t>The outbound agency that ticks all of those boxes is Netswick. It's my company. We specialize fully in branded merch outbound, we work with leaders like Swag.com and Imprint Engine, and we've booked almost 500 meetings for promo companies in just the last three months.</w:t>
+      </w:r>
+    </w:p>
+    <w:p>
+      <w:pPr>
+        <w:spacing w:after="160"/>
+      </w:pPr>
+      <w:r>
+        <w:t>If you want a custom outbound strategy built for your branded merch company, you can book a call with me below.</w:t>
       </w:r>
     </w:p>
     <w:p>

</xml_diff>

<commit_message>
Broaden agency description, remove specific tactics
https://claude.ai/code/session_01UCsqcSBVJHQqXEgMPyvNno
</commit_message>
<xml_diff>
--- a/scripts/zoominfo-vs-outbound-agency-script.docx
+++ b/scripts/zoominfo-vs-outbound-agency-script.docx
@@ -193,7 +193,7 @@
         <w:spacing w:after="160"/>
       </w:pPr>
       <w:r>
-        <w:t>Walk through this linearly from start to finish:</w:t>
+        <w:t>The simplest way to understand it is to walk through it start to finish:</w:t>
       </w:r>
     </w:p>
     <w:p>
@@ -208,7 +208,7 @@
         <w:t xml:space="preserve">&gt;&gt; </w:t>
       </w:r>
       <w:r>
-        <w:t>RESEARCH: They start by analyzing your past clients. Which industries spent the most, what company sizes, what use cases drove those purchases. Trade shows? Onboarding kits? Corporate gifting? They find the pattern in who bought from you repeatedly and spent the most.</w:t>
+        <w:t>They do the research to figure out who you should be targeting and what kind of offer to reach out with. Looking at your past clients, your best customers, your industry, and building a strategy around that.</w:t>
       </w:r>
     </w:p>
     <w:p>
@@ -223,7 +223,7 @@
         <w:t xml:space="preserve">&gt;&gt; </w:t>
       </w:r>
       <w:r>
-        <w:t>TRENDING PRODUCTS: Then they research what products are trending in those industries right now. So when they reach out on your behalf, they're offering a specific Carhartt jacket or Yeti Rambler, not 'we do branded merch.'</w:t>
+        <w:t>They build the prospect lists for you using B2B databases and other tools to find the right companies and decision makers.</w:t>
       </w:r>
     </w:p>
     <w:p>
@@ -238,7 +238,7 @@
         <w:t xml:space="preserve">&gt;&gt; </w:t>
       </w:r>
       <w:r>
-        <w:t>LIST BUILDING: They build the prospect list using B2B databases. Usually cheaper and better ones than ZoomInfo like Prospeo or Apollo.</w:t>
+        <w:t>They figure out which of those prospects are more likely to need promo right now versus eventually, so the outreach is going to the right people at the right time.</w:t>
       </w:r>
     </w:p>
     <w:p>
@@ -253,7 +253,31 @@
         <w:t xml:space="preserve">&gt;&gt; </w:t>
       </w:r>
       <w:r>
-        <w:t>BUYING SIGNALS: Then they run AI agents across the entire list to find which companies have upcoming events, which ones are hiring in bulk, which ones just got funded, which ones opened a new office. So they're only reaching the companies that actually have a reason to buy promo right now. Not blasting 10,000 random contacts.</w:t>
+        <w:t>They set up the entire infrastructure for doing outreach at scale. This is the part most people underestimate.</w:t>
+      </w:r>
+    </w:p>
+    <w:p>
+      <w:pPr>
+        <w:spacing w:after="160"/>
+      </w:pPr>
+      <w:r>
+        <w:t>For email: that means setting up dozens of secondary domains, hundreds of inboxes, warming everything up with AI so the emails actually land in the inbox. Using dedicated sending tools, not your CRM.</w:t>
+      </w:r>
+    </w:p>
+    <w:p>
+      <w:pPr>
+        <w:spacing w:after="160"/>
+      </w:pPr>
+      <w:r>
+        <w:t>For LinkedIn: setting up multiple accounts, connecting automation tools that send personalized connection requests and messages at volume.</w:t>
+      </w:r>
+    </w:p>
+    <w:p>
+      <w:pPr>
+        <w:spacing w:after="160"/>
+      </w:pPr>
+      <w:r>
+        <w:t>For cold calling: getting a power dialer set up with AI voicemail detection, area code matching so your number looks local, and auto-skipping dead lines.</w:t>
       </w:r>
     </w:p>
     <w:p>
@@ -268,31 +292,7 @@
         <w:t xml:space="preserve">&gt;&gt; </w:t>
       </w:r>
       <w:r>
-        <w:t>INFRASTRUCTURE: They set up the entire infrastructure for doing outreach at scale across multiple channels.</w:t>
-      </w:r>
-    </w:p>
-    <w:p>
-      <w:pPr>
-        <w:spacing w:after="160"/>
-      </w:pPr>
-      <w:r>
-        <w:t>For email: setting up 50+ secondary domains, a hundred inboxes, warming everything up with AI for two weeks so Google and Outlook trust the accounts. Using a dedicated cold email tool, not HubSpot or Outlook.</w:t>
-      </w:r>
-    </w:p>
-    <w:p>
-      <w:pPr>
-        <w:spacing w:after="160"/>
-      </w:pPr>
-      <w:r>
-        <w:t>For LinkedIn: setting up multiple accounts, connecting an automation tool that sends personalized connection requests and messages at volume.</w:t>
-      </w:r>
-    </w:p>
-    <w:p>
-      <w:pPr>
-        <w:spacing w:after="160"/>
-      </w:pPr>
-      <w:r>
-        <w:t>For cold calling: getting a power dialer set up and optimizing for high connection rates with AI voicemail detection, area code matching so your number looks local, and auto-skipping dead lines.</w:t>
+        <w:t>They write all the outreach messaging for you and manage the campaigns day to day.</w:t>
       </w:r>
     </w:p>
     <w:p>
@@ -307,7 +307,7 @@
         <w:t xml:space="preserve">&gt;&gt; </w:t>
       </w:r>
       <w:r>
-        <w:t>MESSAGING: They write the outreach copy. Specific product ideas tied to the prospect's use case and buying signal. Positioned as a creative partner, not a vendor asking them to browse a catalog.</w:t>
+        <w:t>When someone responds with interest, the agency handles the back and forth, qualifies them, and books the meeting directly on your salesperson's calendar.</w:t>
       </w:r>
     </w:p>
     <w:p>
@@ -322,7 +322,7 @@
         <w:t xml:space="preserve">&gt;&gt; </w:t>
       </w:r>
       <w:r>
-        <w:t>LEAD MANAGEMENT: When someone responds positively, the agency handles the back and forth. They call interested leads within minutes, qualify them, and book the meeting directly on your salesperson's calendar.</w:t>
+        <w:t>Before the meeting, they send the prospect relevant materials so by the time your salesperson gets on the call, the prospect already has context and is ready for a real conversation.</w:t>
       </w:r>
     </w:p>
     <w:p>
@@ -337,22 +337,7 @@
         <w:t xml:space="preserve">&gt;&gt; </w:t>
       </w:r>
       <w:r>
-        <w:t>NURTURING: Before the meeting, they send the prospect case studies, a catalog, social proof. So by the time your salesperson gets on the call, the prospect already knows your company and is ready to have a real conversation.</w:t>
-      </w:r>
-    </w:p>
-    <w:p>
-      <w:pPr>
-        <w:spacing w:after="120"/>
-      </w:pPr>
-      <w:r>
-        <w:rPr>
-          <w:b/>
-          <w:color w:val="646464"/>
-        </w:rPr>
-        <w:t xml:space="preserve">&gt;&gt; </w:t>
-      </w:r>
-      <w:r>
-        <w:t>Your salesperson just shows up and closes. That's the entire value chain from research to closed deal.</w:t>
+        <w:t>Your salesperson just shows up and closes. That's the whole thing from research to booked meeting.</w:t>
       </w:r>
     </w:p>
     <w:p>

</xml_diff>

<commit_message>
Balanced hook, shorter infra/GTM/outro, full-service disclaimer
https://claude.ai/code/session_01UCsqcSBVJHQqXEgMPyvNno
</commit_message>
<xml_diff>
--- a/scripts/zoominfo-vs-outbound-agency-script.docx
+++ b/scripts/zoominfo-vs-outbound-agency-script.docx
@@ -49,7 +49,7 @@
           <w:color w:val="969696"/>
           <w:sz w:val="18"/>
         </w:rPr>
-        <w:t>[0:00 - 0:25]</w:t>
+        <w:t>[0:00 - 0:30]</w:t>
       </w:r>
     </w:p>
     <w:p>
@@ -57,7 +57,7 @@
         <w:spacing w:after="160"/>
       </w:pPr>
       <w:r>
-        <w:t>My agency has booked almost 500 sales meetings for branded merch companies in the past three months. Including getting leads from HubSpot, Hilton, Uber, Stripe, and Charter Communications, which is a $50 billion enterprise.</w:t>
+        <w:t>So my agency works with companies like Swag.com and Imprint Engine, and we've booked almost 500 sales meetings for branded merch companies in the past three months. Including leads from HubSpot, Hilton, Uber, Stripe, and Charter Communications, which is a $50 billion enterprise.</w:t>
       </w:r>
     </w:p>
     <w:p>
@@ -65,7 +65,7 @@
         <w:spacing w:after="160"/>
       </w:pPr>
       <w:r>
-        <w:t>I've also had clients come to me after spending $15,000 to $30,000 a year on ZoomInfo and getting almost nothing from it.</w:t>
+        <w:t>At the same time, ZoomInfo has been around for years. It's one of the most well-known sales tools in B2B. Thousands of companies use it. It has a massive database. And a lot of promo companies swear by it.</w:t>
       </w:r>
     </w:p>
     <w:p>
@@ -73,7 +73,7 @@
         <w:spacing w:after="160"/>
       </w:pPr>
       <w:r>
-        <w:t>So today I'm going to break down both options honestly. What each one is, the pros and cons, and which one makes sense depending on your company size.</w:t>
+        <w:t>So which one actually makes more sense for a branded merch company? I'm going to break down both options. What each one is, the pros and cons, and which one fits depending on your company size.</w:t>
       </w:r>
     </w:p>
     <w:p>
@@ -193,7 +193,7 @@
         <w:spacing w:after="160"/>
       </w:pPr>
       <w:r>
-        <w:t>The simplest way to understand it is to walk through it start to finish:</w:t>
+        <w:t>Now I want to be clear. This is what a full-service outbound agency does. Not all agencies do all of this. Some just send you leads and call it a day. But a proper full-service one handles everything from start to finish:</w:t>
       </w:r>
     </w:p>
     <w:p>
@@ -208,7 +208,7 @@
         <w:t xml:space="preserve">&gt;&gt; </w:t>
       </w:r>
       <w:r>
-        <w:t>They do the research to figure out who you should be targeting and what kind of offer to reach out with. Looking at your past clients, your best customers, your industry, and building a strategy around that.</w:t>
+        <w:t>They do the research to figure out who you should be targeting and what offer to reach out with. Looking at your past clients, your industry, building a strategy around that.</w:t>
       </w:r>
     </w:p>
     <w:p>
@@ -223,7 +223,7 @@
         <w:t xml:space="preserve">&gt;&gt; </w:t>
       </w:r>
       <w:r>
-        <w:t>They build the prospect lists for you using B2B databases and other tools to find the right companies and decision makers.</w:t>
+        <w:t>They build the prospect lists using B2B databases and tools to find the right companies and decision makers.</w:t>
       </w:r>
     </w:p>
     <w:p>
@@ -238,7 +238,7 @@
         <w:t xml:space="preserve">&gt;&gt; </w:t>
       </w:r>
       <w:r>
-        <w:t>They figure out which of those prospects are more likely to need promo right now versus eventually, so the outreach is going to the right people at the right time.</w:t>
+        <w:t>They figure out which prospects are more likely to need promo right now versus eventually, so the outreach goes to the right people at the right time.</w:t>
       </w:r>
     </w:p>
     <w:p>
@@ -253,31 +253,7 @@
         <w:t xml:space="preserve">&gt;&gt; </w:t>
       </w:r>
       <w:r>
-        <w:t>They set up the entire infrastructure for doing outreach at scale. This is the part most people underestimate.</w:t>
-      </w:r>
-    </w:p>
-    <w:p>
-      <w:pPr>
-        <w:spacing w:after="160"/>
-      </w:pPr>
-      <w:r>
-        <w:t>For email: that means setting up dozens of secondary domains, hundreds of inboxes, warming everything up with AI so the emails actually land in the inbox. Using dedicated sending tools, not your CRM.</w:t>
-      </w:r>
-    </w:p>
-    <w:p>
-      <w:pPr>
-        <w:spacing w:after="160"/>
-      </w:pPr>
-      <w:r>
-        <w:t>For LinkedIn: setting up multiple accounts, connecting automation tools that send personalized connection requests and messages at volume.</w:t>
-      </w:r>
-    </w:p>
-    <w:p>
-      <w:pPr>
-        <w:spacing w:after="160"/>
-      </w:pPr>
-      <w:r>
-        <w:t>For cold calling: getting a power dialer set up with AI voicemail detection, area code matching so your number looks local, and auto-skipping dead lines.</w:t>
+        <w:t>They set up the infrastructure for doing outreach at scale across email, LinkedIn, and calling. Domains, inboxes, warm-up, automation tools, power dialers, the whole technical setup that most teams don't know how to build.</w:t>
       </w:r>
     </w:p>
     <w:p>
@@ -292,7 +268,7 @@
         <w:t xml:space="preserve">&gt;&gt; </w:t>
       </w:r>
       <w:r>
-        <w:t>They write all the outreach messaging for you and manage the campaigns day to day.</w:t>
+        <w:t>They write the messaging, manage campaigns daily, handle replies, qualify interested leads, and book the meeting directly on your salesperson's calendar.</w:t>
       </w:r>
     </w:p>
     <w:p>
@@ -307,22 +283,7 @@
         <w:t xml:space="preserve">&gt;&gt; </w:t>
       </w:r>
       <w:r>
-        <w:t>When someone responds with interest, the agency handles the back and forth, qualifies them, and books the meeting directly on your salesperson's calendar.</w:t>
-      </w:r>
-    </w:p>
-    <w:p>
-      <w:pPr>
-        <w:spacing w:after="120"/>
-      </w:pPr>
-      <w:r>
-        <w:rPr>
-          <w:b/>
-          <w:color w:val="646464"/>
-        </w:rPr>
-        <w:t xml:space="preserve">&gt;&gt; </w:t>
-      </w:r>
-      <w:r>
-        <w:t>Before the meeting, they send the prospect relevant materials so by the time your salesperson gets on the call, the prospect already has context and is ready for a real conversation.</w:t>
+        <w:t>Before the meeting, they send the prospect relevant materials so they have context going in.</w:t>
       </w:r>
     </w:p>
     <w:p>
@@ -796,7 +757,7 @@
         <w:t xml:space="preserve">&gt;&gt; </w:t>
       </w:r>
       <w:r>
-        <w:t>The other option is hiring a go-to-market engineer internally. Someone who knows all the AI tools, the infrastructure, the messaging, the deliverability. That person is going to cost you above $10K a month in salary alone. Which is the same or more than an agency. Except the agency comes with the tools, the systems, the proven playbook, and a team. The internal hire comes with a learning curve and no guarantee they know your industry.</w:t>
+        <w:t>The other option is hiring a GTM engineer internally. But that's not just a $10K+ monthly salary. It's payroll taxes, benefits, medical, training, management time, and the risk that they leave in six months and you start over. All in you're probably looking at $13K-$15K a month for one person. An agency costs less than that and comes with a full team, the tools already paid for, and a proven system. No ramp-up time.</w:t>
       </w:r>
     </w:p>
     <w:p>
@@ -834,22 +795,7 @@
         <w:t xml:space="preserve">&gt;&gt; </w:t>
       </w:r>
       <w:r>
-        <w:t>At this size you probably have internal marketing teams, SDR teams, demand gen people. Hiring a GTM engineer or building an internal outbound function makes more sense here because you have the budget and infrastructure to support it.</w:t>
-      </w:r>
-    </w:p>
-    <w:p>
-      <w:pPr>
-        <w:spacing w:after="120"/>
-      </w:pPr>
-      <w:r>
-        <w:rPr>
-          <w:b/>
-          <w:color w:val="646464"/>
-        </w:rPr>
-        <w:t xml:space="preserve">&gt;&gt; </w:t>
-      </w:r>
-      <w:r>
-        <w:t>You might still use an agency for specific campaigns or new markets. But you have options that a $10M company doesn't.</w:t>
+        <w:t>This is where hiring a GTM engineer internally starts to make sense. You have the budget to absorb the full cost of a senior hire, the infrastructure to support them, and enough volume to justify a dedicated person. An agency can still add value for specific campaigns or new markets, but at this size building it in-house is a real option.</w:t>
       </w:r>
     </w:p>
     <w:p>
@@ -1006,23 +952,7 @@
         <w:spacing w:after="160"/>
       </w:pPr>
       <w:r>
-        <w:t>So that's the honest breakdown. ZoomInfo gives you contacts. An outbound agency gives you meetings. Both have their place depending on where you are as a company.</w:t>
-      </w:r>
-    </w:p>
-    <w:p>
-      <w:pPr>
-        <w:spacing w:after="160"/>
-      </w:pPr>
-      <w:r>
-        <w:t>The outbound agency that ticks all of those boxes is Netswick. It's my company. We specialize fully in branded merch outbound, we work with leaders like Swag.com and Imprint Engine, and we've booked almost 500 meetings for promo companies in just the last three months.</w:t>
-      </w:r>
-    </w:p>
-    <w:p>
-      <w:pPr>
-        <w:spacing w:after="160"/>
-      </w:pPr>
-      <w:r>
-        <w:t>If you want a custom outbound strategy built for your branded merch company, you can book a call with me below.</w:t>
+        <w:t>Netswick is that type of agency. If you want a custom outbound strategy built for your branded merch company, book a call with me below.</w:t>
       </w:r>
     </w:p>
     <w:p>

</xml_diff>

<commit_message>
Shorten all sections: hook, pros/cons, who its best for, agency criteria
https://claude.ai/code/session_01UCsqcSBVJHQqXEgMPyvNno
</commit_message>
<xml_diff>
--- a/scripts/zoominfo-vs-outbound-agency-script.docx
+++ b/scripts/zoominfo-vs-outbound-agency-script.docx
@@ -57,7 +57,7 @@
         <w:spacing w:after="160"/>
       </w:pPr>
       <w:r>
-        <w:t>So my agency works with companies like Swag.com and Imprint Engine, and we've booked almost 500 sales meetings for branded merch companies in the past three months. Including leads from HubSpot, Hilton, Uber, Stripe, and Charter Communications, which is a $50 billion enterprise.</w:t>
+        <w:t>My agency works with Swag.com, Imprint Engine, and we've booked almost 500 sales meetings for branded merch companies in three months. Leads from HubSpot, Hilton, Uber, Stripe, Charter Communications which is a $50 billion enterprise.</w:t>
       </w:r>
     </w:p>
     <w:p>
@@ -65,15 +65,7 @@
         <w:spacing w:after="160"/>
       </w:pPr>
       <w:r>
-        <w:t>At the same time, ZoomInfo has been around for years. It's one of the most well-known sales tools in B2B. Thousands of companies use it. It has a massive database. And a lot of promo companies swear by it.</w:t>
-      </w:r>
-    </w:p>
-    <w:p>
-      <w:pPr>
-        <w:spacing w:after="160"/>
-      </w:pPr>
-      <w:r>
-        <w:t>So which one actually makes more sense for a branded merch company? I'm going to break down both options. What each one is, the pros and cons, and which one fits depending on your company size.</w:t>
+        <w:t>ZoomInfo has been around for years though. Massive database. Thousands of companies use it. So which one actually makes more sense for a branded merch company? I'm going to break down both honestly.</w:t>
       </w:r>
     </w:p>
     <w:p>
@@ -343,7 +335,7 @@
         <w:t xml:space="preserve">&gt;&gt; </w:t>
       </w:r>
       <w:r>
-        <w:t>You own the data. Export the contacts, they're yours forever, use them across any tool.</w:t>
+        <w:t>You own the data. Export the contacts, yours forever, use them anywhere.</w:t>
       </w:r>
     </w:p>
     <w:p>
@@ -358,7 +350,7 @@
         <w:t xml:space="preserve">&gt;&gt; </w:t>
       </w:r>
       <w:r>
-        <w:t>Full control over messaging and brand. Nobody is emailing prospects with your company name unless you're the one writing it.</w:t>
+        <w:t>Full control over messaging and brand. Nobody emails prospects with your name unless you wrote it.</w:t>
       </w:r>
     </w:p>
     <w:p>
@@ -373,7 +365,7 @@
         <w:t xml:space="preserve">&gt;&gt; </w:t>
       </w:r>
       <w:r>
-        <w:t>Can be cheaper than an agency IF you already have a sales team that knows how to prospect and set up infrastructure. Big if.</w:t>
+        <w:t>Can be cheaper than an agency if you already have a team that knows how to prospect. Big if.</w:t>
       </w:r>
     </w:p>
     <w:p>
@@ -388,7 +380,7 @@
         <w:t xml:space="preserve">&gt;&gt; </w:t>
       </w:r>
       <w:r>
-        <w:t>Secondary uses beyond outreach: enriching CRM data, researching companies before meetings, keeping contact info fresh.</w:t>
+        <w:t>Secondary uses: enriching CRM data, researching companies before meetings.</w:t>
       </w:r>
     </w:p>
     <w:p>
@@ -411,7 +403,7 @@
         <w:t xml:space="preserve">&gt;&gt; </w:t>
       </w:r>
       <w:r>
-        <w:t>Data quality is not great. People change jobs, emails go dead, numbers disconnect. One prospect told me he found contacts on ZoomInfo who had retired, sold their business, or passed away. Extreme example but the general problem is real. A lot of the data is stale.</w:t>
+        <w:t>Data quality is not great. People change jobs, emails go dead. One prospect told me he found contacts who had retired or passed away. A lot of the data is stale.</w:t>
       </w:r>
     </w:p>
     <w:p>
@@ -426,7 +418,7 @@
         <w:t xml:space="preserve">&gt;&gt; </w:t>
       </w:r>
       <w:r>
-        <w:t>It gives you contacts but zero system. You still need to figure out infrastructure, messaging, deliverability, follow-ups, calling, booking. If your team doesn't know how to run cold outreach, the data sits in a spreadsheet and nothing happens.</w:t>
+        <w:t>It gives you contacts but zero system. You still need infrastructure, messaging, deliverability, everything. If your team can't run cold outreach, the data sits in a spreadsheet.</w:t>
       </w:r>
     </w:p>
     <w:p>
@@ -441,7 +433,7 @@
         <w:t xml:space="preserve">&gt;&gt; </w:t>
       </w:r>
       <w:r>
-        <w:t>Example: a promo company sent 5,000 emails from ZoomInfo contacts and booked 3 meetings. The data wasn't the problem. Generic messaging, no buying signals, sent from their main domain through HubSpot, most of it landed in spam.</w:t>
+        <w:t>A promo company sent 5,000 emails from ZoomInfo contacts and booked 3 meetings. Generic messaging, no targeting, sent from HubSpot. Landed in spam.</w:t>
       </w:r>
     </w:p>
     <w:p>
@@ -456,7 +448,7 @@
         <w:t xml:space="preserve">&gt;&gt; </w:t>
       </w:r>
       <w:r>
-        <w:t>It's overpriced for what it is. Newer databases like Prospeo, Apollo, Ocean.io offer comparable or better data at a fraction of the cost. So even if you want a database, ZoomInfo might not be the best value.</w:t>
+        <w:t>It's overpriced. Prospeo, Apollo, Ocean.io offer comparable data at a fraction of the cost.</w:t>
       </w:r>
     </w:p>
     <w:p>
@@ -501,7 +493,7 @@
         <w:t xml:space="preserve">&gt;&gt; </w:t>
       </w:r>
       <w:r>
-        <w:t>TIME: They save you massive amounts of time. Your team doesn't have to learn how to set up email infrastructure, configure domains, write cold outreach copy, manage campaigns daily. Someone who's done this thousands of times is going to set it up faster and better than someone learning from scratch.</w:t>
+        <w:t>TIME: Someone who's done this thousands of times sets it up faster and better than your team learning from scratch.</w:t>
       </w:r>
     </w:p>
     <w:p>
@@ -516,7 +508,7 @@
         <w:t xml:space="preserve">&gt;&gt; </w:t>
       </w:r>
       <w:r>
-        <w:t>MONEY: They save you the wasted money you'd spend testing and failing on your own. Every bad campaign you run yourself costs you in burned domains, lost sender reputation, and months of no results. An agency that specializes in your space skips the testing phase because they already know what works.</w:t>
+        <w:t>MONEY: They skip the testing phase. Every bad campaign you run yourself costs you burned domains, lost sender reputation, and months of nothing. A specialized agency already knows what works.</w:t>
       </w:r>
     </w:p>
     <w:p>
@@ -531,7 +523,7 @@
         <w:t xml:space="preserve">&gt;&gt; </w:t>
       </w:r>
       <w:r>
-        <w:t>SKILL GAP: The knowledge required to run modern outbound changes every few months. AI tools, deliverability rules, new platforms. Your reps and marketing team aren't going to keep up with this. It's a full-time specialty.</w:t>
+        <w:t>SKILL GAP: Modern outbound changes every few months. AI tools, deliverability rules, new platforms. Your reps and marketing team aren't keeping up with this. It's a full-time specialty.</w:t>
       </w:r>
     </w:p>
     <w:p>
@@ -546,22 +538,7 @@
         <w:t xml:space="preserve">&gt;&gt; </w:t>
       </w:r>
       <w:r>
-        <w:t>SCALE: The biggest one. Because your team is not spending time building and managing the outreach system, they now have time to handle MORE leads. You're not just getting leads with less work. You're freeing up your salespeople to actually sell. So you get more meetings AND your team has more bandwidth to close them. That compounds. That's how companies scale fast.</w:t>
-      </w:r>
-    </w:p>
-    <w:p>
-      <w:pPr>
-        <w:spacing w:after="120"/>
-      </w:pPr>
-      <w:r>
-        <w:rPr>
-          <w:b/>
-          <w:color w:val="646464"/>
-        </w:rPr>
-        <w:t xml:space="preserve">&gt;&gt; </w:t>
-      </w:r>
-      <w:r>
-        <w:t>A specialized agency knows what works in promo specifically. No three-month testing phase. They plug you into a proven system and you see results from week one.</w:t>
+        <w:t>SCALE: Your team isn't spending time building the system, so they have bandwidth to handle more leads and actually close them. You get more meetings AND more capacity to convert them. That's how companies scale fast.</w:t>
       </w:r>
     </w:p>
     <w:p>
@@ -584,7 +561,7 @@
         <w:t xml:space="preserve">&gt;&gt; </w:t>
       </w:r>
       <w:r>
-        <w:t>You give up some control. Someone else is reaching prospects with your company name. If the messaging is off or the tone doesn't match your brand, it reflects on you. A good agency lets you approve everything, but it still requires trust.</w:t>
+        <w:t>You give up some control. Someone else is reaching prospects with your name. A good agency lets you approve everything, but it still requires trust.</w:t>
       </w:r>
     </w:p>
     <w:p>
@@ -599,7 +576,7 @@
         <w:t xml:space="preserve">&gt;&gt; </w:t>
       </w:r>
       <w:r>
-        <w:t>Higher monthly cost than a database subscription. You're paying for a team, not just data access. For smaller companies that fee can be hard to justify early on.</w:t>
+        <w:t>Higher monthly cost than a database. You're paying for a team, not just data. Harder to justify for smaller companies.</w:t>
       </w:r>
     </w:p>
     <w:p>
@@ -614,7 +591,7 @@
         <w:t xml:space="preserve">&gt;&gt; </w:t>
       </w:r>
       <w:r>
-        <w:t>Results in terms of closed deals aren't instant. You'll see meetings booked quickly, often in the first week or two. But the promo sales cycle is long. Someone might love your stuff on the call and not place their first order for three to six months. ROI takes time to show on the P&amp;L even when the system is working.</w:t>
+        <w:t>Closed deals aren't instant. Meetings book fast, but the promo sales cycle is long. ROI takes a few months to show even when the system is working.</w:t>
       </w:r>
     </w:p>
     <w:p>
@@ -629,7 +606,7 @@
         <w:t xml:space="preserve">&gt;&gt; </w:t>
       </w:r>
       <w:r>
-        <w:t>Most agencies are bad. If they don't specialize in promo, they'll waste months. If they lock you into long contracts before proving anything, red flag. More on how to pick a good one in a second.</w:t>
+        <w:t>Most agencies are bad. If they don't specialize in promo, they'll waste months testing. More on how to pick a good one in a second.</w:t>
       </w:r>
     </w:p>
     <w:p>
@@ -644,7 +621,7 @@
         <w:t xml:space="preserve">&gt;&gt; </w:t>
       </w:r>
       <w:r>
-        <w:t>Conflict of interest. If they work with other promo companies, you need to make sure they're not reaching the same prospects for your competitors.</w:t>
+        <w:t>Conflict of interest. If they work with other promo companies, make sure they're not reaching the same prospects for your competitors.</w:t>
       </w:r>
     </w:p>
     <w:p>
@@ -674,7 +651,7 @@
         <w:spacing w:after="160"/>
       </w:pPr>
       <w:r>
-        <w:t>Under $2M in revenue:</w:t>
+        <w:t>Under $2M:</w:t>
       </w:r>
     </w:p>
     <w:p>
@@ -689,7 +666,7 @@
         <w:t xml:space="preserve">&gt;&gt; </w:t>
       </w:r>
       <w:r>
-        <w:t>A database is probably the right move at this size. Not ZoomInfo though. Apollo or Prospeo for a tenth of the price. Learn Smartlead. Set up your own domains. Write your own copy. You'll make mistakes, takes a few months, but the budget might not be there for an agency yet.</w:t>
+        <w:t>Database is the right move. Not ZoomInfo though. Apollo or Prospeo for a tenth of the price. Learn Smartlead. DIY it. Budget probably isn't there for an agency yet.</w:t>
       </w:r>
     </w:p>
     <w:p>
@@ -697,7 +674,7 @@
         <w:spacing w:after="160"/>
       </w:pPr>
       <w:r>
-        <w:t>$2M to $100M in revenue:</w:t>
+        <w:t>$2M to $100M:</w:t>
       </w:r>
     </w:p>
     <w:p>
@@ -712,7 +689,7 @@
         <w:t xml:space="preserve">&gt;&gt; </w:t>
       </w:r>
       <w:r>
-        <w:t>This is where an outbound agency wins clearly.</w:t>
+        <w:t>Outbound agency wins. Your reps have become account managers. Your marketing team is stretched. Neither is going to build and run a daily outreach operation.</w:t>
       </w:r>
     </w:p>
     <w:p>
@@ -727,7 +704,7 @@
         <w:t xml:space="preserve">&gt;&gt; </w:t>
       </w:r>
       <w:r>
-        <w:t>Your sales reps have become account managers. They service existing clients, handle reorders, chase renewals. They're not prospecting and they won't start.</w:t>
+        <w:t>You could hire a GTM engineer internally. But it's not just salary. It's payroll taxes, benefits, medical, training, management, and the risk they leave in six months. All in, $13K-$15K a month for one person. An agency costs less and comes with a full team, tools included, proven system, no ramp-up.</w:t>
       </w:r>
     </w:p>
     <w:p>
@@ -742,7 +719,15 @@
         <w:t xml:space="preserve">&gt;&gt; </w:t>
       </w:r>
       <w:r>
-        <w:t>Your marketing team is stretched across website, trade shows, social media, catalogs. They can't absorb running a daily outreach operation on top of everything else.</w:t>
+        <w:t>If an agency books you 15-20 meetings a month and you close a couple into $50K-$100K annual accounts, the return pays for the service many times over.</w:t>
+      </w:r>
+    </w:p>
+    <w:p>
+      <w:pPr>
+        <w:spacing w:after="160"/>
+      </w:pPr>
+      <w:r>
+        <w:t>Above $100M:</w:t>
       </w:r>
     </w:p>
     <w:p>
@@ -757,45 +742,7 @@
         <w:t xml:space="preserve">&gt;&gt; </w:t>
       </w:r>
       <w:r>
-        <w:t>The other option is hiring a GTM engineer internally. But that's not just a $10K+ monthly salary. It's payroll taxes, benefits, medical, training, management time, and the risk that they leave in six months and you start over. All in you're probably looking at $13K-$15K a month for one person. An agency costs less than that and comes with a full team, the tools already paid for, and a proven system. No ramp-up time.</w:t>
-      </w:r>
-    </w:p>
-    <w:p>
-      <w:pPr>
-        <w:spacing w:after="120"/>
-      </w:pPr>
-      <w:r>
-        <w:rPr>
-          <w:b/>
-          <w:color w:val="646464"/>
-        </w:rPr>
-        <w:t xml:space="preserve">&gt;&gt; </w:t>
-      </w:r>
-      <w:r>
-        <w:t>At this revenue level the math works. If an agency books you 15-20 qualified meetings a month and you close even a couple into accounts spending $50K-$100K a year, the return pays for the service many times over.</w:t>
-      </w:r>
-    </w:p>
-    <w:p>
-      <w:pPr>
-        <w:spacing w:after="160"/>
-      </w:pPr>
-      <w:r>
-        <w:t>Above $100M in revenue:</w:t>
-      </w:r>
-    </w:p>
-    <w:p>
-      <w:pPr>
-        <w:spacing w:after="120"/>
-      </w:pPr>
-      <w:r>
-        <w:rPr>
-          <w:b/>
-          <w:color w:val="646464"/>
-        </w:rPr>
-        <w:t xml:space="preserve">&gt;&gt; </w:t>
-      </w:r>
-      <w:r>
-        <w:t>This is where hiring a GTM engineer internally starts to make sense. You have the budget to absorb the full cost of a senior hire, the infrastructure to support them, and enough volume to justify a dedicated person. An agency can still add value for specific campaigns or new markets, but at this size building it in-house is a real option.</w:t>
+        <w:t>Hiring a GTM engineer in-house makes sense at this size. You have the budget, infrastructure, and volume to justify it. An agency can still help with specific campaigns but building internally is a real option here.</w:t>
       </w:r>
     </w:p>
     <w:p>
@@ -832,7 +779,7 @@
         <w:t xml:space="preserve">&gt;&gt; </w:t>
       </w:r>
       <w:r>
-        <w:t>They specialize in promo. Not dentists and SaaS on the side. Full promo specialization. If they don't know the industry, they're going to waste months testing angles that someone specialized already knows don't work.</w:t>
+        <w:t>They specialize in promo. If they don't know the industry, they'll waste months testing what a specialized agency already knows.</w:t>
       </w:r>
     </w:p>
     <w:p>
@@ -847,7 +794,7 @@
         <w:t xml:space="preserve">&gt;&gt; </w:t>
       </w:r>
       <w:r>
-        <w:t>Short commitment. You should be able to see results within the first month. If they want 6-12 months upfront before proving anything, walk away.</w:t>
+        <w:t>Short commitment. Results within the first month. If they want 6-12 months upfront, walk away.</w:t>
       </w:r>
     </w:p>
     <w:p>
@@ -862,7 +809,7 @@
         <w:t xml:space="preserve">&gt;&gt; </w:t>
       </w:r>
       <w:r>
-        <w:t>They guarantee a specific number of meetings, not just leads. Leads are vanity. Meetings are what fills your pipeline. They should be able to tell you exactly how many qualified meetings to expect.</w:t>
+        <w:t>They guarantee meetings, not just leads. They should tell you exactly how many qualified meetings to expect.</w:t>
       </w:r>
     </w:p>
     <w:p>
@@ -877,7 +824,7 @@
         <w:t xml:space="preserve">&gt;&gt; </w:t>
       </w:r>
       <w:r>
-        <w:t>The ROI should map out to at least 10x on your investment with them. If they can't walk you through this math on a call and show you exactly how the numbers work based on your average deal size, that's a red flag.</w:t>
+        <w:t>ROI maps out to at least 10x your investment. If they can't walk you through the math based on your deal size, red flag.</w:t>
       </w:r>
     </w:p>
     <w:p>
@@ -892,7 +839,7 @@
         <w:t xml:space="preserve">&gt;&gt; </w:t>
       </w:r>
       <w:r>
-        <w:t>They have real case studies. Not 'we sent 50,000 emails.' Actual qualified meetings booked and deals closed for companies similar to yours.</w:t>
+        <w:t>Real case studies. Actual meetings booked and deals closed for companies like yours. Not 'we sent 50,000 emails.'</w:t>
       </w:r>
     </w:p>
     <w:p>
@@ -907,7 +854,7 @@
         <w:t xml:space="preserve">&gt;&gt; </w:t>
       </w:r>
       <w:r>
-        <w:t>They should be a smaller, leaner team. Not a massive company that signs you up and hands you off to some random account manager. You want people who are heavily focused on your account and deeply specialized in what they do.</w:t>
+        <w:t>Smaller, leaner team. Not a massive company that hands you off to a random account manager. You want people heavily focused on your account.</w:t>
       </w:r>
     </w:p>
     <w:p>
@@ -922,7 +869,7 @@
         <w:t xml:space="preserve">&gt;&gt; </w:t>
       </w:r>
       <w:r>
-        <w:t>They handle the full funnel. Research, infrastructure, messaging, replies, calling, booking, nurturing. If they just hand you interested leads and say good luck, that's ZoomInfo with a markup.</w:t>
+        <w:t>Full funnel. Research, infrastructure, messaging, replies, calling, booking, nurturing. If they just hand you leads and say good luck, that's ZoomInfo with a markup.</w:t>
       </w:r>
     </w:p>
     <w:p>

</xml_diff>

<commit_message>
Shorter hook, trimmed agency pros/cons, natural framing
https://claude.ai/code/session_01UCsqcSBVJHQqXEgMPyvNno
</commit_message>
<xml_diff>
--- a/scripts/zoominfo-vs-outbound-agency-script.docx
+++ b/scripts/zoominfo-vs-outbound-agency-script.docx
@@ -57,7 +57,7 @@
         <w:spacing w:after="160"/>
       </w:pPr>
       <w:r>
-        <w:t>My agency works with Swag.com, Imprint Engine, and we've booked almost 500 sales meetings for branded merch companies in three months. Leads from HubSpot, Hilton, Uber, Stripe, Charter Communications which is a $50 billion enterprise.</w:t>
+        <w:t>My agency works with Swag.com, Imprint Engine, and we've booked almost 500 sales meetings for promo companies in three months including leads from HubSpot, Hilton, Uber, Stripe, and Charter Communications.</w:t>
       </w:r>
     </w:p>
     <w:p>
@@ -65,7 +65,7 @@
         <w:spacing w:after="160"/>
       </w:pPr>
       <w:r>
-        <w:t>ZoomInfo has been around for years though. Massive database. Thousands of companies use it. So which one actually makes more sense for a branded merch company? I'm going to break down both honestly.</w:t>
+        <w:t>A lot of the promo companies I talk to are either already on ZoomInfo or they're deciding between ZoomInfo and hiring an outbound agency. So I want to give you the honest comparison so you can figure out which one fits your situation.</w:t>
       </w:r>
     </w:p>
     <w:p>
@@ -493,7 +493,7 @@
         <w:t xml:space="preserve">&gt;&gt; </w:t>
       </w:r>
       <w:r>
-        <w:t>TIME: Someone who's done this thousands of times sets it up faster and better than your team learning from scratch.</w:t>
+        <w:t>Saves you time and money. They already know what works so there's no testing phase. Every failed campaign you run yourself costs burned domains and months of nothing.</w:t>
       </w:r>
     </w:p>
     <w:p>
@@ -508,7 +508,7 @@
         <w:t xml:space="preserve">&gt;&gt; </w:t>
       </w:r>
       <w:r>
-        <w:t>MONEY: They skip the testing phase. Every bad campaign you run yourself costs you burned domains, lost sender reputation, and months of nothing. A specialized agency already knows what works.</w:t>
+        <w:t>Bridges the skill gap. Modern outbound is a full-time specialty. Your reps and marketing team aren't keeping up with it.</w:t>
       </w:r>
     </w:p>
     <w:p>
@@ -523,22 +523,7 @@
         <w:t xml:space="preserve">&gt;&gt; </w:t>
       </w:r>
       <w:r>
-        <w:t>SKILL GAP: Modern outbound changes every few months. AI tools, deliverability rules, new platforms. Your reps and marketing team aren't keeping up with this. It's a full-time specialty.</w:t>
-      </w:r>
-    </w:p>
-    <w:p>
-      <w:pPr>
-        <w:spacing w:after="120"/>
-      </w:pPr>
-      <w:r>
-        <w:rPr>
-          <w:b/>
-          <w:color w:val="646464"/>
-        </w:rPr>
-        <w:t xml:space="preserve">&gt;&gt; </w:t>
-      </w:r>
-      <w:r>
-        <w:t>SCALE: Your team isn't spending time building the system, so they have bandwidth to handle more leads and actually close them. You get more meetings AND more capacity to convert them. That's how companies scale fast.</w:t>
+        <w:t>Frees up your team to handle more leads and actually close them. More meetings coming in AND more capacity to convert. That compounds.</w:t>
       </w:r>
     </w:p>
     <w:p>
@@ -561,7 +546,7 @@
         <w:t xml:space="preserve">&gt;&gt; </w:t>
       </w:r>
       <w:r>
-        <w:t>You give up some control. Someone else is reaching prospects with your name. A good agency lets you approve everything, but it still requires trust.</w:t>
+        <w:t>You give up some control over messaging and brand. Requires trust.</w:t>
       </w:r>
     </w:p>
     <w:p>
@@ -576,7 +561,7 @@
         <w:t xml:space="preserve">&gt;&gt; </w:t>
       </w:r>
       <w:r>
-        <w:t>Higher monthly cost than a database. You're paying for a team, not just data. Harder to justify for smaller companies.</w:t>
+        <w:t>Higher monthly cost than a database. Harder to justify for smaller companies.</w:t>
       </w:r>
     </w:p>
     <w:p>
@@ -591,7 +576,7 @@
         <w:t xml:space="preserve">&gt;&gt; </w:t>
       </w:r>
       <w:r>
-        <w:t>Closed deals aren't instant. Meetings book fast, but the promo sales cycle is long. ROI takes a few months to show even when the system is working.</w:t>
+        <w:t>Meetings book fast but the promo sales cycle is long. ROI takes a few months to show.</w:t>
       </w:r>
     </w:p>
     <w:p>
@@ -606,7 +591,7 @@
         <w:t xml:space="preserve">&gt;&gt; </w:t>
       </w:r>
       <w:r>
-        <w:t>Most agencies are bad. If they don't specialize in promo, they'll waste months testing. More on how to pick a good one in a second.</w:t>
+        <w:t>Most agencies are bad. If they don't specialize in promo, they waste months.</w:t>
       </w:r>
     </w:p>
     <w:p>
@@ -621,7 +606,7 @@
         <w:t xml:space="preserve">&gt;&gt; </w:t>
       </w:r>
       <w:r>
-        <w:t>Conflict of interest. If they work with other promo companies, make sure they're not reaching the same prospects for your competitors.</w:t>
+        <w:t>Conflict of interest if they work with other promo companies. Make sure they're not hitting the same prospects.</w:t>
       </w:r>
     </w:p>
     <w:p>

</xml_diff>